<commit_message>
design: v0.3 status table (research and orchestration implemented)
Co-Authored-By: Claude Sonnet 5.5 <noreply@anthropic.com>
</commit_message>
<xml_diff>
--- a/design/Synapser_Diseno.docx
+++ b/design/Synapser_Diseno.docx
@@ -12279,7 +12279,7 @@
                 <w:color w:val="111111"/>
                 <w:sz w:val="20"/>
               </w:rPr>
-              <w:t xml:space="preserve">Catálogo, enrutador, workflow con aprobaciones, subtareas pedidas por agentes, costo estimado</w:t>
+              <w:t xml:space="preserve">Catálogo, enrutador determinista, costo conocido/estimado/desconocido, compuertas de aprobación, despacho por el puerto, subtareas pedidas por agentes (W1–W5)</w:t>
             </w:r>
           </w:p>
         </w:tc>
@@ -12314,7 +12314,7 @@
                 <w:color w:val="111111"/>
                 <w:sz w:val="20"/>
               </w:rPr>
-              <w:t xml:space="preserve">Propuesto</w:t>
+              <w:t xml:space="preserve">Implementado y cubierto por pruebas; falta el workflow con editor y las aprobaciones desde la interfaz</w:t>
             </w:r>
           </w:p>
         </w:tc>
@@ -12609,7 +12609,7 @@
                 <w:color w:val="111111"/>
                 <w:sz w:val="20"/>
               </w:rPr>
-              <w:t xml:space="preserve">Investigación web con Tavily (puerto, citas con procedencia)</w:t>
+              <w:t xml:space="preserve">Investigación web: puerto con Tavily, guarda de consultas, presupuesto, citas con procedencia, misión T0</w:t>
             </w:r>
           </w:p>
         </w:tc>
@@ -12644,7 +12644,7 @@
                 <w:color w:val="111111"/>
                 <w:sz w:val="20"/>
               </w:rPr>
-              <w:t xml:space="preserve">Propuesto</w:t>
+              <w:t xml:space="preserve">Implementado; verificado contra el servicio real</w:t>
             </w:r>
           </w:p>
         </w:tc>

</xml_diff>

<commit_message>
Live demo missions, repair-profile routing fix, README and design status
- demo-live: --mission billing|currency (currency is accepted only with
  sources retrieved in this run)
- router: a repair-specialised profile no longer wins ordinary work by
  sorting first
- README rewritten for the current system (no measured results)
- design v0.3 status table: UI and observation implemented

Co-Authored-By: Claude Sonnet 5.5 <noreply@anthropic.com>
</commit_message>
<xml_diff>
--- a/design/Synapser_Diseno.docx
+++ b/design/Synapser_Diseno.docx
@@ -12314,7 +12314,7 @@
                 <w:color w:val="111111"/>
                 <w:sz w:val="20"/>
               </w:rPr>
-              <w:t xml:space="preserve">Implementado y cubierto por pruebas; falta el workflow con editor y las aprobaciones desde la interfaz</w:t>
+              <w:t xml:space="preserve">Implementado y cubierto por pruebas, incluidas las aprobaciones desde la interfaz y los reintentos entre perfiles</w:t>
             </w:r>
           </w:p>
         </w:tc>
@@ -12389,7 +12389,7 @@
                 <w:color w:val="111111"/>
                 <w:sz w:val="20"/>
               </w:rPr>
-              <w:t xml:space="preserve">Colector de observación de Zoanthrope y proyección de estado vivo</w:t>
+              <w:t xml:space="preserve">Colector de observación de Zoanthrope, intenciones declaradas y proyección de estado vivo reproducible por seq</w:t>
             </w:r>
           </w:p>
         </w:tc>
@@ -12424,7 +12424,7 @@
                 <w:color w:val="111111"/>
                 <w:sz w:val="20"/>
               </w:rPr>
-              <w:t xml:space="preserve">Propuesto; requiere spike S-Z</w:t>
+              <w:t xml:space="preserve">Implementado; spike S-Z hecho contra el binario fijado</w:t>
             </w:r>
           </w:p>
         </w:tc>
@@ -12499,7 +12499,7 @@
                 <w:color w:val="111111"/>
                 <w:sz w:val="20"/>
               </w:rPr>
-              <w:t xml:space="preserve">Interfaz web con API JSON/SSE</w:t>
+              <w:t xml:space="preserve">Interfaz web (React, Tailwind y shadcn/ui) con API JSON/SSE; demo determinista y demo con modelos reales</w:t>
             </w:r>
           </w:p>
         </w:tc>
@@ -12534,7 +12534,7 @@
                 <w:color w:val="111111"/>
                 <w:sz w:val="20"/>
               </w:rPr>
-              <w:t xml:space="preserve">Propuesto</w:t>
+              <w:t xml:space="preserve">Implementado; verificada en un navegador real</w:t>
             </w:r>
           </w:p>
         </w:tc>
@@ -18736,7 +18736,7 @@
     </w:p>
     <w:p>
       <w:r>
-        <w:t xml:space="preserve">La interfaz es una aplicación web servida por un servidor HTTP sin dependencias, con una API JSON delgada y SSE para el flujo vivo. Regla de diseño: cada cifra mostrada es una consulta sobre el registro y cita los eventos que la sustentan; la interfaz no tiene estado propio.</w:t>
+        <w:t xml:space="preserve">La interfaz es una aplicación React (Tailwind y shadcn/ui) compilada a un artefacto estático que sirve un servidor HTTP sin dependencias, con una API JSON delgada y SSE para el flujo vivo. Regla de diseño: cada cifra mostrada es una consulta sobre el registro y cita los eventos que la sustentan; la interfaz no tiene estado propio.</w:t>
       </w:r>
     </w:p>
     <w:tbl>

</xml_diff>

<commit_message>
Design doc v0.4: command centre sections 30-36 (plan 13)
Co-Authored-By: Claude Sonnet 5.5 <noreply@anthropic.com>
</commit_message>
<xml_diff>
--- a/design/Synapser_Diseno.docx
+++ b/design/Synapser_Diseno.docx
@@ -29,7 +29,34 @@
         <w:rPr>
           <w:sz w:val="19"/>
         </w:rPr>
-        <w:t>13 de octubre de 2026  ·  Versión 0.3  ·  Diseño con implementación verificada</w:t>
+        <w:t>13 de octubre de 2026  ·  Versión 0.4  ·  Diseño con implementación verificada</w:t>
+      </w:r>
+    </w:p>
+    <w:p>
+      <w:pPr>
+        <w:pStyle w:val="Heading2"/>
+      </w:pPr>
+      <w:r>
+        <w:rPr>
+          <w:color w:val="000000"/>
+        </w:rPr>
+        <w:t xml:space="preserve">Qué cambió en la versión 0.4</w:t>
+      </w:r>
+    </w:p>
+    <w:p>
+      <w:pPr>
+        <w:pStyle w:val="ListBullet"/>
+      </w:pPr>
+      <w:r>
+        <w:t xml:space="preserve">Synapser pasa a ser un centro de mando para multiagentes: servidor MCP, workflows con condiciones de aceptación, compuertas duras de efectos, asesor con Nemotron y Tavily, niveles y pools de agentes, y chat en la consola web (secciones 30 a 36).</w:t>
+      </w:r>
+    </w:p>
+    <w:p>
+      <w:pPr>
+        <w:pStyle w:val="ListBullet"/>
+      </w:pPr>
+      <w:r>
+        <w:t xml:space="preserve">Todo lo anterior está implementado y probado; las secciones 20 a 29 siguen vigentes.</w:t>
       </w:r>
     </w:p>
     <w:p>
@@ -21525,6 +21552,2497 @@
       </w:tr>
     </w:tbl>
     <w:p/>
+    <w:p>
+      <w:pPr>
+        <w:pStyle w:val="Heading1"/>
+      </w:pPr>
+      <w:r>
+        <w:rPr>
+          <w:color w:val="000000"/>
+        </w:rPr>
+        <w:t xml:space="preserve">30 Centro de mando: visión y alcance (plan 13)</w:t>
+      </w:r>
+    </w:p>
+    <w:p>
+      <w:r>
+        <w:t xml:space="preserve">Synapser pasa de motor de coordinación a un pequeño centro de mando para enjambres de agentes. Esta sección y las siguientes describen lo agregado en la versión 0.4; todo está implementado y cubierto por pruebas automáticas, salvo lo señalado como límite en la sección 36.</w:t>
+      </w:r>
+    </w:p>
+    <w:tbl>
+      <w:tblPr>
+        <w:tblW w:type="auto" w:w="0"/>
+        <w:jc w:val="center"/>
+        <w:tblLayout w:type="fixed"/>
+        <w:tblLook w:firstColumn="1" w:firstRow="1" w:lastColumn="0" w:lastRow="0" w:noHBand="0" w:noVBand="1" w:val="04A0"/>
+      </w:tblPr>
+      <w:tblGrid>
+        <w:gridCol w:w="2200"/>
+        <w:gridCol w:w="6580"/>
+        <w:gridCol w:w="1300"/>
+      </w:tblGrid>
+      <w:tr>
+        <w:trPr>
+          <w:tblHeader/>
+        </w:trPr>
+        <w:tc>
+          <w:tcPr>
+            <w:tcW w:type="dxa" w:w="2200"/>
+            <w:vAlign w:val="center"/>
+            <w:tcMar>
+              <w:top w:w="85" w:type="dxa"/>
+              <w:left w:w="100" w:type="dxa"/>
+              <w:bottom w:w="85" w:type="dxa"/>
+              <w:right w:w="100" w:type="dxa"/>
+            </w:tcMar>
+            <w:shd w:fill="183A52"/>
+            <w:tcBorders>
+              <w:top w:val="single" w:sz="4" w:color="D9D9D9"/>
+              <w:left w:val="single" w:sz="4" w:color="D9D9D9"/>
+              <w:bottom w:val="single" w:sz="4" w:color="D9D9D9"/>
+              <w:right w:val="single" w:sz="4" w:color="D9D9D9"/>
+            </w:tcBorders>
+          </w:tcPr>
+          <w:p>
+            <w:pPr>
+              <w:widowControl/>
+              <w:spacing w:after="0" w:line="250" w:lineRule="auto"/>
+              <w:jc w:val="left"/>
+            </w:pPr>
+            <w:r>
+              <w:rPr>
+                <w:rFonts w:ascii="Arial" w:hAnsi="Arial"/>
+                <w:b/>
+                <w:color w:val="FFFFFF"/>
+                <w:sz w:val="20"/>
+              </w:rPr>
+              <w:t xml:space="preserve">Capacidad</w:t>
+            </w:r>
+          </w:p>
+        </w:tc>
+        <w:tc>
+          <w:tcPr>
+            <w:tcW w:type="dxa" w:w="6580"/>
+            <w:vAlign w:val="center"/>
+            <w:tcMar>
+              <w:top w:w="85" w:type="dxa"/>
+              <w:left w:w="100" w:type="dxa"/>
+              <w:bottom w:w="85" w:type="dxa"/>
+              <w:right w:w="100" w:type="dxa"/>
+            </w:tcMar>
+            <w:shd w:fill="183A52"/>
+            <w:tcBorders>
+              <w:top w:val="single" w:sz="4" w:color="D9D9D9"/>
+              <w:left w:val="single" w:sz="4" w:color="D9D9D9"/>
+              <w:bottom w:val="single" w:sz="4" w:color="D9D9D9"/>
+              <w:right w:val="single" w:sz="4" w:color="D9D9D9"/>
+            </w:tcBorders>
+          </w:tcPr>
+          <w:p>
+            <w:pPr>
+              <w:widowControl/>
+              <w:spacing w:after="0" w:line="250" w:lineRule="auto"/>
+              <w:jc w:val="left"/>
+            </w:pPr>
+            <w:r>
+              <w:rPr>
+                <w:rFonts w:ascii="Arial" w:hAnsi="Arial"/>
+                <w:b/>
+                <w:color w:val="FFFFFF"/>
+                <w:sz w:val="20"/>
+              </w:rPr>
+              <w:t xml:space="preserve">Qué hace</w:t>
+            </w:r>
+          </w:p>
+        </w:tc>
+        <w:tc>
+          <w:tcPr>
+            <w:tcW w:type="dxa" w:w="1300"/>
+            <w:vAlign w:val="center"/>
+            <w:tcMar>
+              <w:top w:w="85" w:type="dxa"/>
+              <w:left w:w="100" w:type="dxa"/>
+              <w:bottom w:w="85" w:type="dxa"/>
+              <w:right w:w="100" w:type="dxa"/>
+            </w:tcMar>
+            <w:shd w:fill="183A52"/>
+            <w:tcBorders>
+              <w:top w:val="single" w:sz="4" w:color="D9D9D9"/>
+              <w:left w:val="single" w:sz="4" w:color="D9D9D9"/>
+              <w:bottom w:val="single" w:sz="4" w:color="D9D9D9"/>
+              <w:right w:val="single" w:sz="4" w:color="D9D9D9"/>
+            </w:tcBorders>
+          </w:tcPr>
+          <w:p>
+            <w:pPr>
+              <w:widowControl/>
+              <w:spacing w:after="0" w:line="250" w:lineRule="auto"/>
+              <w:jc w:val="left"/>
+            </w:pPr>
+            <w:r>
+              <w:rPr>
+                <w:rFonts w:ascii="Arial" w:hAnsi="Arial"/>
+                <w:b/>
+                <w:color w:val="FFFFFF"/>
+                <w:sz w:val="20"/>
+              </w:rPr>
+              <w:t xml:space="preserve">Plan</w:t>
+            </w:r>
+          </w:p>
+        </w:tc>
+      </w:tr>
+      <w:tr>
+        <w:trPr>
+          <w:cantSplit/>
+        </w:trPr>
+        <w:tc>
+          <w:tcPr>
+            <w:tcW w:type="dxa" w:w="2200"/>
+            <w:vAlign w:val="center"/>
+            <w:tcMar>
+              <w:top w:w="85" w:type="dxa"/>
+              <w:left w:w="100" w:type="dxa"/>
+              <w:bottom w:w="85" w:type="dxa"/>
+              <w:right w:w="100" w:type="dxa"/>
+            </w:tcMar>
+            <w:shd w:fill="F0F5F8"/>
+            <w:tcBorders>
+              <w:top w:val="single" w:sz="4" w:color="D9D9D9"/>
+              <w:left w:val="single" w:sz="4" w:color="D9D9D9"/>
+              <w:bottom w:val="single" w:sz="4" w:color="D9D9D9"/>
+              <w:right w:val="single" w:sz="4" w:color="D9D9D9"/>
+            </w:tcBorders>
+          </w:tcPr>
+          <w:p>
+            <w:pPr>
+              <w:widowControl/>
+              <w:spacing w:after="0" w:line="250" w:lineRule="auto"/>
+              <w:jc w:val="left"/>
+            </w:pPr>
+            <w:r>
+              <w:rPr>
+                <w:rFonts w:ascii="Arial" w:hAnsi="Arial"/>
+                <w:b w:val="0"/>
+                <w:color w:val="111111"/>
+                <w:sz w:val="20"/>
+              </w:rPr>
+              <w:t xml:space="preserve">Servidor MCP</w:t>
+            </w:r>
+          </w:p>
+        </w:tc>
+        <w:tc>
+          <w:tcPr>
+            <w:tcW w:type="dxa" w:w="6580"/>
+            <w:vAlign w:val="center"/>
+            <w:tcMar>
+              <w:top w:w="85" w:type="dxa"/>
+              <w:left w:w="100" w:type="dxa"/>
+              <w:bottom w:w="85" w:type="dxa"/>
+              <w:right w:w="100" w:type="dxa"/>
+            </w:tcMar>
+            <w:shd w:fill="F0F5F8"/>
+            <w:tcBorders>
+              <w:top w:val="single" w:sz="4" w:color="D9D9D9"/>
+              <w:left w:val="single" w:sz="4" w:color="D9D9D9"/>
+              <w:bottom w:val="single" w:sz="4" w:color="D9D9D9"/>
+              <w:right w:val="single" w:sz="4" w:color="D9D9D9"/>
+            </w:tcBorders>
+          </w:tcPr>
+          <w:p>
+            <w:pPr>
+              <w:widowControl/>
+              <w:spacing w:after="0" w:line="250" w:lineRule="auto"/>
+              <w:jc w:val="left"/>
+            </w:pPr>
+            <w:r>
+              <w:rPr>
+                <w:rFonts w:ascii="Arial" w:hAnsi="Arial"/>
+                <w:b w:val="0"/>
+                <w:color w:val="111111"/>
+                <w:sz w:val="20"/>
+              </w:rPr>
+              <w:t xml:space="preserve">Los agentes se conectan por MCP; el rol (iniciador, operador, trabajador) lo fija quien lanza el proceso, nunca el cliente; cada llamada queda en el ledger con quién la hizo</w:t>
+            </w:r>
+          </w:p>
+        </w:tc>
+        <w:tc>
+          <w:tcPr>
+            <w:tcW w:type="dxa" w:w="1300"/>
+            <w:vAlign w:val="center"/>
+            <w:tcMar>
+              <w:top w:w="85" w:type="dxa"/>
+              <w:left w:w="100" w:type="dxa"/>
+              <w:bottom w:w="85" w:type="dxa"/>
+              <w:right w:w="100" w:type="dxa"/>
+            </w:tcMar>
+            <w:shd w:fill="F0F5F8"/>
+            <w:tcBorders>
+              <w:top w:val="single" w:sz="4" w:color="D9D9D9"/>
+              <w:left w:val="single" w:sz="4" w:color="D9D9D9"/>
+              <w:bottom w:val="single" w:sz="4" w:color="D9D9D9"/>
+              <w:right w:val="single" w:sz="4" w:color="D9D9D9"/>
+            </w:tcBorders>
+          </w:tcPr>
+          <w:p>
+            <w:pPr>
+              <w:widowControl/>
+              <w:spacing w:after="0" w:line="250" w:lineRule="auto"/>
+              <w:jc w:val="left"/>
+            </w:pPr>
+            <w:r>
+              <w:rPr>
+                <w:rFonts w:ascii="Arial" w:hAnsi="Arial"/>
+                <w:b w:val="0"/>
+                <w:color w:val="111111"/>
+                <w:sz w:val="20"/>
+              </w:rPr>
+              <w:t xml:space="preserve">13 P1</w:t>
+            </w:r>
+          </w:p>
+        </w:tc>
+      </w:tr>
+      <w:tr>
+        <w:trPr>
+          <w:cantSplit/>
+        </w:trPr>
+        <w:tc>
+          <w:tcPr>
+            <w:tcW w:type="dxa" w:w="2200"/>
+            <w:vAlign w:val="center"/>
+            <w:tcMar>
+              <w:top w:w="85" w:type="dxa"/>
+              <w:left w:w="100" w:type="dxa"/>
+              <w:bottom w:w="85" w:type="dxa"/>
+              <w:right w:w="100" w:type="dxa"/>
+            </w:tcMar>
+            <w:shd w:fill="FFFFFF"/>
+            <w:tcBorders>
+              <w:top w:val="single" w:sz="4" w:color="D9D9D9"/>
+              <w:left w:val="single" w:sz="4" w:color="D9D9D9"/>
+              <w:bottom w:val="single" w:sz="4" w:color="D9D9D9"/>
+              <w:right w:val="single" w:sz="4" w:color="D9D9D9"/>
+            </w:tcBorders>
+          </w:tcPr>
+          <w:p>
+            <w:pPr>
+              <w:widowControl/>
+              <w:spacing w:after="0" w:line="250" w:lineRule="auto"/>
+              <w:jc w:val="left"/>
+            </w:pPr>
+            <w:r>
+              <w:rPr>
+                <w:rFonts w:ascii="Arial" w:hAnsi="Arial"/>
+                <w:b w:val="0"/>
+                <w:color w:val="111111"/>
+                <w:sz w:val="20"/>
+              </w:rPr>
+              <w:t xml:space="preserve">Workflow y condiciones</w:t>
+            </w:r>
+          </w:p>
+        </w:tc>
+        <w:tc>
+          <w:tcPr>
+            <w:tcW w:type="dxa" w:w="6580"/>
+            <w:vAlign w:val="center"/>
+            <w:tcMar>
+              <w:top w:w="85" w:type="dxa"/>
+              <w:left w:w="100" w:type="dxa"/>
+              <w:bottom w:w="85" w:type="dxa"/>
+              <w:right w:w="100" w:type="dxa"/>
+            </w:tcMar>
+            <w:shd w:fill="FFFFFF"/>
+            <w:tcBorders>
+              <w:top w:val="single" w:sz="4" w:color="D9D9D9"/>
+              <w:left w:val="single" w:sz="4" w:color="D9D9D9"/>
+              <w:bottom w:val="single" w:sz="4" w:color="D9D9D9"/>
+              <w:right w:val="single" w:sz="4" w:color="D9D9D9"/>
+            </w:tcBorders>
+          </w:tcPr>
+          <w:p>
+            <w:pPr>
+              <w:widowControl/>
+              <w:spacing w:after="0" w:line="250" w:lineRule="auto"/>
+              <w:jc w:val="left"/>
+            </w:pPr>
+            <w:r>
+              <w:rPr>
+                <w:rFonts w:ascii="Arial" w:hAnsi="Arial"/>
+                <w:b w:val="0"/>
+                <w:color w:val="111111"/>
+                <w:sz w:val="20"/>
+              </w:rPr>
+              <w:t xml:space="preserve">Una tarea con descripción, metas y no-metas; termina cuando todas las condiciones de aceptación obligatorias se cumplen con evidencia; cada condición es una tarea atómica verificable</w:t>
+            </w:r>
+          </w:p>
+        </w:tc>
+        <w:tc>
+          <w:tcPr>
+            <w:tcW w:type="dxa" w:w="1300"/>
+            <w:vAlign w:val="center"/>
+            <w:tcMar>
+              <w:top w:w="85" w:type="dxa"/>
+              <w:left w:w="100" w:type="dxa"/>
+              <w:bottom w:w="85" w:type="dxa"/>
+              <w:right w:w="100" w:type="dxa"/>
+            </w:tcMar>
+            <w:shd w:fill="FFFFFF"/>
+            <w:tcBorders>
+              <w:top w:val="single" w:sz="4" w:color="D9D9D9"/>
+              <w:left w:val="single" w:sz="4" w:color="D9D9D9"/>
+              <w:bottom w:val="single" w:sz="4" w:color="D9D9D9"/>
+              <w:right w:val="single" w:sz="4" w:color="D9D9D9"/>
+            </w:tcBorders>
+          </w:tcPr>
+          <w:p>
+            <w:pPr>
+              <w:widowControl/>
+              <w:spacing w:after="0" w:line="250" w:lineRule="auto"/>
+              <w:jc w:val="left"/>
+            </w:pPr>
+            <w:r>
+              <w:rPr>
+                <w:rFonts w:ascii="Arial" w:hAnsi="Arial"/>
+                <w:b w:val="0"/>
+                <w:color w:val="111111"/>
+                <w:sz w:val="20"/>
+              </w:rPr>
+              <w:t xml:space="preserve">13 P1</w:t>
+            </w:r>
+          </w:p>
+        </w:tc>
+      </w:tr>
+      <w:tr>
+        <w:trPr>
+          <w:cantSplit/>
+        </w:trPr>
+        <w:tc>
+          <w:tcPr>
+            <w:tcW w:type="dxa" w:w="2200"/>
+            <w:vAlign w:val="center"/>
+            <w:tcMar>
+              <w:top w:w="85" w:type="dxa"/>
+              <w:left w:w="100" w:type="dxa"/>
+              <w:bottom w:w="85" w:type="dxa"/>
+              <w:right w:w="100" w:type="dxa"/>
+            </w:tcMar>
+            <w:shd w:fill="F0F5F8"/>
+            <w:tcBorders>
+              <w:top w:val="single" w:sz="4" w:color="D9D9D9"/>
+              <w:left w:val="single" w:sz="4" w:color="D9D9D9"/>
+              <w:bottom w:val="single" w:sz="4" w:color="D9D9D9"/>
+              <w:right w:val="single" w:sz="4" w:color="D9D9D9"/>
+            </w:tcBorders>
+          </w:tcPr>
+          <w:p>
+            <w:pPr>
+              <w:widowControl/>
+              <w:spacing w:after="0" w:line="250" w:lineRule="auto"/>
+              <w:jc w:val="left"/>
+            </w:pPr>
+            <w:r>
+              <w:rPr>
+                <w:rFonts w:ascii="Arial" w:hAnsi="Arial"/>
+                <w:b w:val="0"/>
+                <w:color w:val="111111"/>
+                <w:sz w:val="20"/>
+              </w:rPr>
+              <w:t xml:space="preserve">Compuertas duras de efectos</w:t>
+            </w:r>
+          </w:p>
+        </w:tc>
+        <w:tc>
+          <w:tcPr>
+            <w:tcW w:type="dxa" w:w="6580"/>
+            <w:vAlign w:val="center"/>
+            <w:tcMar>
+              <w:top w:w="85" w:type="dxa"/>
+              <w:left w:w="100" w:type="dxa"/>
+              <w:bottom w:w="85" w:type="dxa"/>
+              <w:right w:w="100" w:type="dxa"/>
+            </w:tcMar>
+            <w:shd w:fill="F0F5F8"/>
+            <w:tcBorders>
+              <w:top w:val="single" w:sz="4" w:color="D9D9D9"/>
+              <w:left w:val="single" w:sz="4" w:color="D9D9D9"/>
+              <w:bottom w:val="single" w:sz="4" w:color="D9D9D9"/>
+              <w:right w:val="single" w:sz="4" w:color="D9D9D9"/>
+            </w:tcBorders>
+          </w:tcPr>
+          <w:p>
+            <w:pPr>
+              <w:widowControl/>
+              <w:spacing w:after="0" w:line="250" w:lineRule="auto"/>
+              <w:jc w:val="left"/>
+            </w:pPr>
+            <w:r>
+              <w:rPr>
+                <w:rFonts w:ascii="Arial" w:hAnsi="Arial"/>
+                <w:b w:val="0"/>
+                <w:color w:val="111111"/>
+                <w:sz w:val="20"/>
+              </w:rPr>
+              <w:t xml:space="preserve">git commit/push, gh pr y http.request solo ocurren tras una decisión humana ligada al digest exacto; el agente no tiene la capacidad, no solo la prohibición</w:t>
+            </w:r>
+          </w:p>
+        </w:tc>
+        <w:tc>
+          <w:tcPr>
+            <w:tcW w:type="dxa" w:w="1300"/>
+            <w:vAlign w:val="center"/>
+            <w:tcMar>
+              <w:top w:w="85" w:type="dxa"/>
+              <w:left w:w="100" w:type="dxa"/>
+              <w:bottom w:w="85" w:type="dxa"/>
+              <w:right w:w="100" w:type="dxa"/>
+            </w:tcMar>
+            <w:shd w:fill="F0F5F8"/>
+            <w:tcBorders>
+              <w:top w:val="single" w:sz="4" w:color="D9D9D9"/>
+              <w:left w:val="single" w:sz="4" w:color="D9D9D9"/>
+              <w:bottom w:val="single" w:sz="4" w:color="D9D9D9"/>
+              <w:right w:val="single" w:sz="4" w:color="D9D9D9"/>
+            </w:tcBorders>
+          </w:tcPr>
+          <w:p>
+            <w:pPr>
+              <w:widowControl/>
+              <w:spacing w:after="0" w:line="250" w:lineRule="auto"/>
+              <w:jc w:val="left"/>
+            </w:pPr>
+            <w:r>
+              <w:rPr>
+                <w:rFonts w:ascii="Arial" w:hAnsi="Arial"/>
+                <w:b w:val="0"/>
+                <w:color w:val="111111"/>
+                <w:sz w:val="20"/>
+              </w:rPr>
+              <w:t xml:space="preserve">13 P2</w:t>
+            </w:r>
+          </w:p>
+        </w:tc>
+      </w:tr>
+      <w:tr>
+        <w:trPr>
+          <w:cantSplit/>
+        </w:trPr>
+        <w:tc>
+          <w:tcPr>
+            <w:tcW w:type="dxa" w:w="2200"/>
+            <w:vAlign w:val="center"/>
+            <w:tcMar>
+              <w:top w:w="85" w:type="dxa"/>
+              <w:left w:w="100" w:type="dxa"/>
+              <w:bottom w:w="85" w:type="dxa"/>
+              <w:right w:w="100" w:type="dxa"/>
+            </w:tcMar>
+            <w:shd w:fill="FFFFFF"/>
+            <w:tcBorders>
+              <w:top w:val="single" w:sz="4" w:color="D9D9D9"/>
+              <w:left w:val="single" w:sz="4" w:color="D9D9D9"/>
+              <w:bottom w:val="single" w:sz="4" w:color="D9D9D9"/>
+              <w:right w:val="single" w:sz="4" w:color="D9D9D9"/>
+            </w:tcBorders>
+          </w:tcPr>
+          <w:p>
+            <w:pPr>
+              <w:widowControl/>
+              <w:spacing w:after="0" w:line="250" w:lineRule="auto"/>
+              <w:jc w:val="left"/>
+            </w:pPr>
+            <w:r>
+              <w:rPr>
+                <w:rFonts w:ascii="Arial" w:hAnsi="Arial"/>
+                <w:b w:val="0"/>
+                <w:color w:val="111111"/>
+                <w:sz w:val="20"/>
+              </w:rPr>
+              <w:t xml:space="preserve">Asesor</w:t>
+            </w:r>
+          </w:p>
+        </w:tc>
+        <w:tc>
+          <w:tcPr>
+            <w:tcW w:type="dxa" w:w="6580"/>
+            <w:vAlign w:val="center"/>
+            <w:tcMar>
+              <w:top w:w="85" w:type="dxa"/>
+              <w:left w:w="100" w:type="dxa"/>
+              <w:bottom w:w="85" w:type="dxa"/>
+              <w:right w:w="100" w:type="dxa"/>
+            </w:tcMar>
+            <w:shd w:fill="FFFFFF"/>
+            <w:tcBorders>
+              <w:top w:val="single" w:sz="4" w:color="D9D9D9"/>
+              <w:left w:val="single" w:sz="4" w:color="D9D9D9"/>
+              <w:bottom w:val="single" w:sz="4" w:color="D9D9D9"/>
+              <w:right w:val="single" w:sz="4" w:color="D9D9D9"/>
+            </w:tcBorders>
+          </w:tcPr>
+          <w:p>
+            <w:pPr>
+              <w:widowControl/>
+              <w:spacing w:after="0" w:line="250" w:lineRule="auto"/>
+              <w:jc w:val="left"/>
+            </w:pPr>
+            <w:r>
+              <w:rPr>
+                <w:rFonts w:ascii="Arial" w:hAnsi="Arial"/>
+                <w:b w:val="0"/>
+                <w:color w:val="111111"/>
+                <w:sz w:val="20"/>
+              </w:rPr>
+              <w:t xml:space="preserve">Nemotron propone intervenciones tipadas (nota, retención, escalada, replan, rollback, pushback); el control las valida y aplica; Tavily aporta el pushback con fuentes realmente recuperadas</w:t>
+            </w:r>
+          </w:p>
+        </w:tc>
+        <w:tc>
+          <w:tcPr>
+            <w:tcW w:type="dxa" w:w="1300"/>
+            <w:vAlign w:val="center"/>
+            <w:tcMar>
+              <w:top w:w="85" w:type="dxa"/>
+              <w:left w:w="100" w:type="dxa"/>
+              <w:bottom w:w="85" w:type="dxa"/>
+              <w:right w:w="100" w:type="dxa"/>
+            </w:tcMar>
+            <w:shd w:fill="FFFFFF"/>
+            <w:tcBorders>
+              <w:top w:val="single" w:sz="4" w:color="D9D9D9"/>
+              <w:left w:val="single" w:sz="4" w:color="D9D9D9"/>
+              <w:bottom w:val="single" w:sz="4" w:color="D9D9D9"/>
+              <w:right w:val="single" w:sz="4" w:color="D9D9D9"/>
+            </w:tcBorders>
+          </w:tcPr>
+          <w:p>
+            <w:pPr>
+              <w:widowControl/>
+              <w:spacing w:after="0" w:line="250" w:lineRule="auto"/>
+              <w:jc w:val="left"/>
+            </w:pPr>
+            <w:r>
+              <w:rPr>
+                <w:rFonts w:ascii="Arial" w:hAnsi="Arial"/>
+                <w:b w:val="0"/>
+                <w:color w:val="111111"/>
+                <w:sz w:val="20"/>
+              </w:rPr>
+              <w:t xml:space="preserve">13 P3</w:t>
+            </w:r>
+          </w:p>
+        </w:tc>
+      </w:tr>
+      <w:tr>
+        <w:trPr>
+          <w:cantSplit/>
+        </w:trPr>
+        <w:tc>
+          <w:tcPr>
+            <w:tcW w:type="dxa" w:w="2200"/>
+            <w:vAlign w:val="center"/>
+            <w:tcMar>
+              <w:top w:w="85" w:type="dxa"/>
+              <w:left w:w="100" w:type="dxa"/>
+              <w:bottom w:w="85" w:type="dxa"/>
+              <w:right w:w="100" w:type="dxa"/>
+            </w:tcMar>
+            <w:shd w:fill="F0F5F8"/>
+            <w:tcBorders>
+              <w:top w:val="single" w:sz="4" w:color="D9D9D9"/>
+              <w:left w:val="single" w:sz="4" w:color="D9D9D9"/>
+              <w:bottom w:val="single" w:sz="4" w:color="D9D9D9"/>
+              <w:right w:val="single" w:sz="4" w:color="D9D9D9"/>
+            </w:tcBorders>
+          </w:tcPr>
+          <w:p>
+            <w:pPr>
+              <w:widowControl/>
+              <w:spacing w:after="0" w:line="250" w:lineRule="auto"/>
+              <w:jc w:val="left"/>
+            </w:pPr>
+            <w:r>
+              <w:rPr>
+                <w:rFonts w:ascii="Arial" w:hAnsi="Arial"/>
+                <w:b w:val="0"/>
+                <w:color w:val="111111"/>
+                <w:sz w:val="20"/>
+              </w:rPr>
+              <w:t xml:space="preserve">Niveles y pools</w:t>
+            </w:r>
+          </w:p>
+        </w:tc>
+        <w:tc>
+          <w:tcPr>
+            <w:tcW w:type="dxa" w:w="6580"/>
+            <w:vAlign w:val="center"/>
+            <w:tcMar>
+              <w:top w:w="85" w:type="dxa"/>
+              <w:left w:w="100" w:type="dxa"/>
+              <w:bottom w:w="85" w:type="dxa"/>
+              <w:right w:w="100" w:type="dxa"/>
+            </w:tcMar>
+            <w:shd w:fill="F0F5F8"/>
+            <w:tcBorders>
+              <w:top w:val="single" w:sz="4" w:color="D9D9D9"/>
+              <w:left w:val="single" w:sz="4" w:color="D9D9D9"/>
+              <w:bottom w:val="single" w:sz="4" w:color="D9D9D9"/>
+              <w:right w:val="single" w:sz="4" w:color="D9D9D9"/>
+            </w:tcBorders>
+          </w:tcPr>
+          <w:p>
+            <w:pPr>
+              <w:widowControl/>
+              <w:spacing w:after="0" w:line="250" w:lineRule="auto"/>
+              <w:jc w:val="left"/>
+            </w:pPr>
+            <w:r>
+              <w:rPr>
+                <w:rFonts w:ascii="Arial" w:hAnsi="Arial"/>
+                <w:b w:val="0"/>
+                <w:color w:val="111111"/>
+                <w:sz w:val="20"/>
+              </w:rPr>
+              <w:t xml:space="preserve">Agentes por nivel (barato, estándar, avanzado); escalera por fallo; pools con concurrencia máxima; agentes configurables por endpoint o CLI; doctor</w:t>
+            </w:r>
+          </w:p>
+        </w:tc>
+        <w:tc>
+          <w:tcPr>
+            <w:tcW w:type="dxa" w:w="1300"/>
+            <w:vAlign w:val="center"/>
+            <w:tcMar>
+              <w:top w:w="85" w:type="dxa"/>
+              <w:left w:w="100" w:type="dxa"/>
+              <w:bottom w:w="85" w:type="dxa"/>
+              <w:right w:w="100" w:type="dxa"/>
+            </w:tcMar>
+            <w:shd w:fill="F0F5F8"/>
+            <w:tcBorders>
+              <w:top w:val="single" w:sz="4" w:color="D9D9D9"/>
+              <w:left w:val="single" w:sz="4" w:color="D9D9D9"/>
+              <w:bottom w:val="single" w:sz="4" w:color="D9D9D9"/>
+              <w:right w:val="single" w:sz="4" w:color="D9D9D9"/>
+            </w:tcBorders>
+          </w:tcPr>
+          <w:p>
+            <w:pPr>
+              <w:widowControl/>
+              <w:spacing w:after="0" w:line="250" w:lineRule="auto"/>
+              <w:jc w:val="left"/>
+            </w:pPr>
+            <w:r>
+              <w:rPr>
+                <w:rFonts w:ascii="Arial" w:hAnsi="Arial"/>
+                <w:b w:val="0"/>
+                <w:color w:val="111111"/>
+                <w:sz w:val="20"/>
+              </w:rPr>
+              <w:t xml:space="preserve">13 P4</w:t>
+            </w:r>
+          </w:p>
+        </w:tc>
+      </w:tr>
+      <w:tr>
+        <w:trPr>
+          <w:cantSplit/>
+        </w:trPr>
+        <w:tc>
+          <w:tcPr>
+            <w:tcW w:type="dxa" w:w="2200"/>
+            <w:vAlign w:val="center"/>
+            <w:tcMar>
+              <w:top w:w="85" w:type="dxa"/>
+              <w:left w:w="100" w:type="dxa"/>
+              <w:bottom w:w="85" w:type="dxa"/>
+              <w:right w:w="100" w:type="dxa"/>
+            </w:tcMar>
+            <w:shd w:fill="FFFFFF"/>
+            <w:tcBorders>
+              <w:top w:val="single" w:sz="4" w:color="D9D9D9"/>
+              <w:left w:val="single" w:sz="4" w:color="D9D9D9"/>
+              <w:bottom w:val="single" w:sz="4" w:color="D9D9D9"/>
+              <w:right w:val="single" w:sz="4" w:color="D9D9D9"/>
+            </w:tcBorders>
+          </w:tcPr>
+          <w:p>
+            <w:pPr>
+              <w:widowControl/>
+              <w:spacing w:after="0" w:line="250" w:lineRule="auto"/>
+              <w:jc w:val="left"/>
+            </w:pPr>
+            <w:r>
+              <w:rPr>
+                <w:rFonts w:ascii="Arial" w:hAnsi="Arial"/>
+                <w:b w:val="0"/>
+                <w:color w:val="111111"/>
+                <w:sz w:val="20"/>
+              </w:rPr>
+              <w:t xml:space="preserve">Chat y consola web</w:t>
+            </w:r>
+          </w:p>
+        </w:tc>
+        <w:tc>
+          <w:tcPr>
+            <w:tcW w:type="dxa" w:w="6580"/>
+            <w:vAlign w:val="center"/>
+            <w:tcMar>
+              <w:top w:w="85" w:type="dxa"/>
+              <w:left w:w="100" w:type="dxa"/>
+              <w:bottom w:w="85" w:type="dxa"/>
+              <w:right w:w="100" w:type="dxa"/>
+            </w:tcMar>
+            <w:shd w:fill="FFFFFF"/>
+            <w:tcBorders>
+              <w:top w:val="single" w:sz="4" w:color="D9D9D9"/>
+              <w:left w:val="single" w:sz="4" w:color="D9D9D9"/>
+              <w:bottom w:val="single" w:sz="4" w:color="D9D9D9"/>
+              <w:right w:val="single" w:sz="4" w:color="D9D9D9"/>
+            </w:tcBorders>
+          </w:tcPr>
+          <w:p>
+            <w:pPr>
+              <w:widowControl/>
+              <w:spacing w:after="0" w:line="250" w:lineRule="auto"/>
+              <w:jc w:val="left"/>
+            </w:pPr>
+            <w:r>
+              <w:rPr>
+                <w:rFonts w:ascii="Arial" w:hAnsi="Arial"/>
+                <w:b w:val="0"/>
+                <w:color w:val="111111"/>
+                <w:sz w:val="20"/>
+              </w:rPr>
+              <w:t xml:space="preserve">Nemotron como interfaz de chat para pedir workflows; vistas de chat, workflows y agentes; el chat no puede iniciar, cancelar ni aprobar</w:t>
+            </w:r>
+          </w:p>
+        </w:tc>
+        <w:tc>
+          <w:tcPr>
+            <w:tcW w:type="dxa" w:w="1300"/>
+            <w:vAlign w:val="center"/>
+            <w:tcMar>
+              <w:top w:w="85" w:type="dxa"/>
+              <w:left w:w="100" w:type="dxa"/>
+              <w:bottom w:w="85" w:type="dxa"/>
+              <w:right w:w="100" w:type="dxa"/>
+            </w:tcMar>
+            <w:shd w:fill="FFFFFF"/>
+            <w:tcBorders>
+              <w:top w:val="single" w:sz="4" w:color="D9D9D9"/>
+              <w:left w:val="single" w:sz="4" w:color="D9D9D9"/>
+              <w:bottom w:val="single" w:sz="4" w:color="D9D9D9"/>
+              <w:right w:val="single" w:sz="4" w:color="D9D9D9"/>
+            </w:tcBorders>
+          </w:tcPr>
+          <w:p>
+            <w:pPr>
+              <w:widowControl/>
+              <w:spacing w:after="0" w:line="250" w:lineRule="auto"/>
+              <w:jc w:val="left"/>
+            </w:pPr>
+            <w:r>
+              <w:rPr>
+                <w:rFonts w:ascii="Arial" w:hAnsi="Arial"/>
+                <w:b w:val="0"/>
+                <w:color w:val="111111"/>
+                <w:sz w:val="20"/>
+              </w:rPr>
+              <w:t xml:space="preserve">13 P5</w:t>
+            </w:r>
+          </w:p>
+        </w:tc>
+      </w:tr>
+    </w:tbl>
+    <w:p/>
+    <w:p>
+      <w:pPr>
+        <w:pStyle w:val="Heading1"/>
+      </w:pPr>
+      <w:r>
+        <w:rPr>
+          <w:color w:val="000000"/>
+        </w:rPr>
+        <w:t xml:space="preserve">31 Workflow, condiciones y compuertas</w:t>
+      </w:r>
+    </w:p>
+    <w:p>
+      <w:r>
+        <w:t xml:space="preserve">Un workflow se define con título, descripción, metas, no-metas y condiciones. Cada condición lleva un verificador determinista: command (identificador de una lista permitida), citations (las URL de un archivo fueron realmente recuperadas), diff (rutas que deben o no deben cambiar), file, approval (aprobación humana), review (opinión de un agente, informativa salvo aceptación explícita) o effect (un efecto aprobado y realizado).</w:t>
+      </w:r>
+    </w:p>
+    <w:p>
+      <w:pPr>
+        <w:pStyle w:val="ListBullet"/>
+      </w:pPr>
+      <w:r>
+        <w:t xml:space="preserve">Ciclo de vida registrado como eventos del ledger: borrador, espera de inicio, planificación, ejecución, verificación, y terminal (hecho, fallido, cancelado).</w:t>
+      </w:r>
+    </w:p>
+    <w:p>
+      <w:pPr>
+        <w:pStyle w:val="ListBullet"/>
+      </w:pPr>
+      <w:r>
+        <w:t xml:space="preserve">Editar un workflow crea una revisión; la ejecución en curso se replanifica, no se muta.</w:t>
+      </w:r>
+    </w:p>
+    <w:p>
+      <w:pPr>
+        <w:pStyle w:val="ListBullet"/>
+      </w:pPr>
+      <w:r>
+        <w:t xml:space="preserve">El inicio puede exigir una compuerta; el desafío (código) se entrega solo por el canal humano, nunca por el ledger ni por MCP.</w:t>
+      </w:r>
+    </w:p>
+    <w:p>
+      <w:pPr>
+        <w:pStyle w:val="ListBullet"/>
+      </w:pPr>
+      <w:r>
+        <w:t xml:space="preserve">Una condición obligatoria de tipo review requiere una segunda aceptación; un modelo no se califica a sí mismo.</w:t>
+      </w:r>
+    </w:p>
+    <w:p>
+      <w:pPr>
+        <w:pStyle w:val="ListBullet"/>
+      </w:pPr>
+      <w:r>
+        <w:t xml:space="preserve">No-metas con guarda (diff o file) se comprueban en cada ronda: violarlas impide terminar aunque todo lo demás se cumpla.</w:t>
+      </w:r>
+    </w:p>
+    <w:p>
+      <w:pPr>
+        <w:pStyle w:val="Heading1"/>
+      </w:pPr>
+      <w:r>
+        <w:rPr>
+          <w:color w:val="000000"/>
+        </w:rPr>
+        <w:t xml:space="preserve">32 Compuertas de efectos</w:t>
+      </w:r>
+    </w:p>
+    <w:p>
+      <w:r>
+        <w:t xml:space="preserve">Los efectos con consecuencias fuera del espacio de trabajo pasan por un corredor único. La política es de negación por defecto y gana la regla más estricta.</w:t>
+      </w:r>
+    </w:p>
+    <w:tbl>
+      <w:tblPr>
+        <w:tblW w:type="auto" w:w="0"/>
+        <w:jc w:val="center"/>
+        <w:tblLayout w:type="fixed"/>
+        <w:tblLook w:firstColumn="1" w:firstRow="1" w:lastColumn="0" w:lastRow="0" w:noHBand="0" w:noVBand="1" w:val="04A0"/>
+      </w:tblPr>
+      <w:tblGrid>
+        <w:gridCol w:w="3000"/>
+        <w:gridCol w:w="7080"/>
+      </w:tblGrid>
+      <w:tr>
+        <w:trPr>
+          <w:tblHeader/>
+        </w:trPr>
+        <w:tc>
+          <w:tcPr>
+            <w:tcW w:type="dxa" w:w="3000"/>
+            <w:vAlign w:val="center"/>
+            <w:tcMar>
+              <w:top w:w="85" w:type="dxa"/>
+              <w:left w:w="100" w:type="dxa"/>
+              <w:bottom w:w="85" w:type="dxa"/>
+              <w:right w:w="100" w:type="dxa"/>
+            </w:tcMar>
+            <w:shd w:fill="183A52"/>
+            <w:tcBorders>
+              <w:top w:val="single" w:sz="4" w:color="D9D9D9"/>
+              <w:left w:val="single" w:sz="4" w:color="D9D9D9"/>
+              <w:bottom w:val="single" w:sz="4" w:color="D9D9D9"/>
+              <w:right w:val="single" w:sz="4" w:color="D9D9D9"/>
+            </w:tcBorders>
+          </w:tcPr>
+          <w:p>
+            <w:pPr>
+              <w:widowControl/>
+              <w:spacing w:after="0" w:line="250" w:lineRule="auto"/>
+              <w:jc w:val="left"/>
+            </w:pPr>
+            <w:r>
+              <w:rPr>
+                <w:rFonts w:ascii="Arial" w:hAnsi="Arial"/>
+                <w:b/>
+                <w:color w:val="FFFFFF"/>
+                <w:sz w:val="20"/>
+              </w:rPr>
+              <w:t xml:space="preserve">Propiedad</w:t>
+            </w:r>
+          </w:p>
+        </w:tc>
+        <w:tc>
+          <w:tcPr>
+            <w:tcW w:type="dxa" w:w="7080"/>
+            <w:vAlign w:val="center"/>
+            <w:tcMar>
+              <w:top w:w="85" w:type="dxa"/>
+              <w:left w:w="100" w:type="dxa"/>
+              <w:bottom w:w="85" w:type="dxa"/>
+              <w:right w:w="100" w:type="dxa"/>
+            </w:tcMar>
+            <w:shd w:fill="183A52"/>
+            <w:tcBorders>
+              <w:top w:val="single" w:sz="4" w:color="D9D9D9"/>
+              <w:left w:val="single" w:sz="4" w:color="D9D9D9"/>
+              <w:bottom w:val="single" w:sz="4" w:color="D9D9D9"/>
+              <w:right w:val="single" w:sz="4" w:color="D9D9D9"/>
+            </w:tcBorders>
+          </w:tcPr>
+          <w:p>
+            <w:pPr>
+              <w:widowControl/>
+              <w:spacing w:after="0" w:line="250" w:lineRule="auto"/>
+              <w:jc w:val="left"/>
+            </w:pPr>
+            <w:r>
+              <w:rPr>
+                <w:rFonts w:ascii="Arial" w:hAnsi="Arial"/>
+                <w:b/>
+                <w:color w:val="FFFFFF"/>
+                <w:sz w:val="20"/>
+              </w:rPr>
+              <w:t xml:space="preserve">Cómo se garantiza</w:t>
+            </w:r>
+          </w:p>
+        </w:tc>
+      </w:tr>
+      <w:tr>
+        <w:trPr>
+          <w:cantSplit/>
+        </w:trPr>
+        <w:tc>
+          <w:tcPr>
+            <w:tcW w:type="dxa" w:w="3000"/>
+            <w:vAlign w:val="center"/>
+            <w:tcMar>
+              <w:top w:w="85" w:type="dxa"/>
+              <w:left w:w="100" w:type="dxa"/>
+              <w:bottom w:w="85" w:type="dxa"/>
+              <w:right w:w="100" w:type="dxa"/>
+            </w:tcMar>
+            <w:shd w:fill="F0F5F8"/>
+            <w:tcBorders>
+              <w:top w:val="single" w:sz="4" w:color="D9D9D9"/>
+              <w:left w:val="single" w:sz="4" w:color="D9D9D9"/>
+              <w:bottom w:val="single" w:sz="4" w:color="D9D9D9"/>
+              <w:right w:val="single" w:sz="4" w:color="D9D9D9"/>
+            </w:tcBorders>
+          </w:tcPr>
+          <w:p>
+            <w:pPr>
+              <w:widowControl/>
+              <w:spacing w:after="0" w:line="250" w:lineRule="auto"/>
+              <w:jc w:val="left"/>
+            </w:pPr>
+            <w:r>
+              <w:rPr>
+                <w:rFonts w:ascii="Arial" w:hAnsi="Arial"/>
+                <w:b w:val="0"/>
+                <w:color w:val="111111"/>
+                <w:sz w:val="20"/>
+              </w:rPr>
+              <w:t xml:space="preserve">El agente no puede empujar por su cuenta</w:t>
+            </w:r>
+          </w:p>
+        </w:tc>
+        <w:tc>
+          <w:tcPr>
+            <w:tcW w:type="dxa" w:w="7080"/>
+            <w:vAlign w:val="center"/>
+            <w:tcMar>
+              <w:top w:w="85" w:type="dxa"/>
+              <w:left w:w="100" w:type="dxa"/>
+              <w:bottom w:w="85" w:type="dxa"/>
+              <w:right w:w="100" w:type="dxa"/>
+            </w:tcMar>
+            <w:shd w:fill="F0F5F8"/>
+            <w:tcBorders>
+              <w:top w:val="single" w:sz="4" w:color="D9D9D9"/>
+              <w:left w:val="single" w:sz="4" w:color="D9D9D9"/>
+              <w:bottom w:val="single" w:sz="4" w:color="D9D9D9"/>
+              <w:right w:val="single" w:sz="4" w:color="D9D9D9"/>
+            </w:tcBorders>
+          </w:tcPr>
+          <w:p>
+            <w:pPr>
+              <w:widowControl/>
+              <w:spacing w:after="0" w:line="250" w:lineRule="auto"/>
+              <w:jc w:val="left"/>
+            </w:pPr>
+            <w:r>
+              <w:rPr>
+                <w:rFonts w:ascii="Arial" w:hAnsi="Arial"/>
+                <w:b w:val="0"/>
+                <w:color w:val="111111"/>
+                <w:sz w:val="20"/>
+              </w:rPr>
+              <w:t xml:space="preserve">El CLI corre con un HOME efímero, sin credenciales del entorno, con git apuntando a la nada y sin .git en la copia; se verificó con agentes reales</w:t>
+            </w:r>
+          </w:p>
+        </w:tc>
+      </w:tr>
+      <w:tr>
+        <w:trPr>
+          <w:cantSplit/>
+        </w:trPr>
+        <w:tc>
+          <w:tcPr>
+            <w:tcW w:type="dxa" w:w="3000"/>
+            <w:vAlign w:val="center"/>
+            <w:tcMar>
+              <w:top w:w="85" w:type="dxa"/>
+              <w:left w:w="100" w:type="dxa"/>
+              <w:bottom w:w="85" w:type="dxa"/>
+              <w:right w:w="100" w:type="dxa"/>
+            </w:tcMar>
+            <w:shd w:fill="FFFFFF"/>
+            <w:tcBorders>
+              <w:top w:val="single" w:sz="4" w:color="D9D9D9"/>
+              <w:left w:val="single" w:sz="4" w:color="D9D9D9"/>
+              <w:bottom w:val="single" w:sz="4" w:color="D9D9D9"/>
+              <w:right w:val="single" w:sz="4" w:color="D9D9D9"/>
+            </w:tcBorders>
+          </w:tcPr>
+          <w:p>
+            <w:pPr>
+              <w:widowControl/>
+              <w:spacing w:after="0" w:line="250" w:lineRule="auto"/>
+              <w:jc w:val="left"/>
+            </w:pPr>
+            <w:r>
+              <w:rPr>
+                <w:rFonts w:ascii="Arial" w:hAnsi="Arial"/>
+                <w:b w:val="0"/>
+                <w:color w:val="111111"/>
+                <w:sz w:val="20"/>
+              </w:rPr>
+              <w:t xml:space="preserve">La aprobación vale para ese efecto exacto</w:t>
+            </w:r>
+          </w:p>
+        </w:tc>
+        <w:tc>
+          <w:tcPr>
+            <w:tcW w:type="dxa" w:w="7080"/>
+            <w:vAlign w:val="center"/>
+            <w:tcMar>
+              <w:top w:w="85" w:type="dxa"/>
+              <w:left w:w="100" w:type="dxa"/>
+              <w:bottom w:w="85" w:type="dxa"/>
+              <w:right w:w="100" w:type="dxa"/>
+            </w:tcMar>
+            <w:shd w:fill="FFFFFF"/>
+            <w:tcBorders>
+              <w:top w:val="single" w:sz="4" w:color="D9D9D9"/>
+              <w:left w:val="single" w:sz="4" w:color="D9D9D9"/>
+              <w:bottom w:val="single" w:sz="4" w:color="D9D9D9"/>
+              <w:right w:val="single" w:sz="4" w:color="D9D9D9"/>
+            </w:tcBorders>
+          </w:tcPr>
+          <w:p>
+            <w:pPr>
+              <w:widowControl/>
+              <w:spacing w:after="0" w:line="250" w:lineRule="auto"/>
+              <w:jc w:val="left"/>
+            </w:pPr>
+            <w:r>
+              <w:rPr>
+                <w:rFonts w:ascii="Arial" w:hAnsi="Arial"/>
+                <w:b w:val="0"/>
+                <w:color w:val="111111"/>
+                <w:sz w:val="20"/>
+              </w:rPr>
+              <w:t xml:space="preserve">La decisión se liga al digest de la solicitud; un cambio posterior la deja obsoleta (STALE)</w:t>
+            </w:r>
+          </w:p>
+        </w:tc>
+      </w:tr>
+      <w:tr>
+        <w:trPr>
+          <w:cantSplit/>
+        </w:trPr>
+        <w:tc>
+          <w:tcPr>
+            <w:tcW w:type="dxa" w:w="3000"/>
+            <w:vAlign w:val="center"/>
+            <w:tcMar>
+              <w:top w:w="85" w:type="dxa"/>
+              <w:left w:w="100" w:type="dxa"/>
+              <w:bottom w:w="85" w:type="dxa"/>
+              <w:right w:w="100" w:type="dxa"/>
+            </w:tcMar>
+            <w:shd w:fill="F0F5F8"/>
+            <w:tcBorders>
+              <w:top w:val="single" w:sz="4" w:color="D9D9D9"/>
+              <w:left w:val="single" w:sz="4" w:color="D9D9D9"/>
+              <w:bottom w:val="single" w:sz="4" w:color="D9D9D9"/>
+              <w:right w:val="single" w:sz="4" w:color="D9D9D9"/>
+            </w:tcBorders>
+          </w:tcPr>
+          <w:p>
+            <w:pPr>
+              <w:widowControl/>
+              <w:spacing w:after="0" w:line="250" w:lineRule="auto"/>
+              <w:jc w:val="left"/>
+            </w:pPr>
+            <w:r>
+              <w:rPr>
+                <w:rFonts w:ascii="Arial" w:hAnsi="Arial"/>
+                <w:b w:val="0"/>
+                <w:color w:val="111111"/>
+                <w:sz w:val="20"/>
+              </w:rPr>
+              <w:t xml:space="preserve">Una vez</w:t>
+            </w:r>
+          </w:p>
+        </w:tc>
+        <w:tc>
+          <w:tcPr>
+            <w:tcW w:type="dxa" w:w="7080"/>
+            <w:vAlign w:val="center"/>
+            <w:tcMar>
+              <w:top w:w="85" w:type="dxa"/>
+              <w:left w:w="100" w:type="dxa"/>
+              <w:bottom w:w="85" w:type="dxa"/>
+              <w:right w:w="100" w:type="dxa"/>
+            </w:tcMar>
+            <w:shd w:fill="F0F5F8"/>
+            <w:tcBorders>
+              <w:top w:val="single" w:sz="4" w:color="D9D9D9"/>
+              <w:left w:val="single" w:sz="4" w:color="D9D9D9"/>
+              <w:bottom w:val="single" w:sz="4" w:color="D9D9D9"/>
+              <w:right w:val="single" w:sz="4" w:color="D9D9D9"/>
+            </w:tcBorders>
+          </w:tcPr>
+          <w:p>
+            <w:pPr>
+              <w:widowControl/>
+              <w:spacing w:after="0" w:line="250" w:lineRule="auto"/>
+              <w:jc w:val="left"/>
+            </w:pPr>
+            <w:r>
+              <w:rPr>
+                <w:rFonts w:ascii="Arial" w:hAnsi="Arial"/>
+                <w:b w:val="0"/>
+                <w:color w:val="111111"/>
+                <w:sz w:val="20"/>
+              </w:rPr>
+              <w:t xml:space="preserve">PENDING, EXECUTING, DONE/FAILED; un efecto realizado no se repite; las aprobaciones caducan (TTL)</w:t>
+            </w:r>
+          </w:p>
+        </w:tc>
+      </w:tr>
+      <w:tr>
+        <w:trPr>
+          <w:cantSplit/>
+        </w:trPr>
+        <w:tc>
+          <w:tcPr>
+            <w:tcW w:type="dxa" w:w="3000"/>
+            <w:vAlign w:val="center"/>
+            <w:tcMar>
+              <w:top w:w="85" w:type="dxa"/>
+              <w:left w:w="100" w:type="dxa"/>
+              <w:bottom w:w="85" w:type="dxa"/>
+              <w:right w:w="100" w:type="dxa"/>
+            </w:tcMar>
+            <w:shd w:fill="FFFFFF"/>
+            <w:tcBorders>
+              <w:top w:val="single" w:sz="4" w:color="D9D9D9"/>
+              <w:left w:val="single" w:sz="4" w:color="D9D9D9"/>
+              <w:bottom w:val="single" w:sz="4" w:color="D9D9D9"/>
+              <w:right w:val="single" w:sz="4" w:color="D9D9D9"/>
+            </w:tcBorders>
+          </w:tcPr>
+          <w:p>
+            <w:pPr>
+              <w:widowControl/>
+              <w:spacing w:after="0" w:line="250" w:lineRule="auto"/>
+              <w:jc w:val="left"/>
+            </w:pPr>
+            <w:r>
+              <w:rPr>
+                <w:rFonts w:ascii="Arial" w:hAnsi="Arial"/>
+                <w:b w:val="0"/>
+                <w:color w:val="111111"/>
+                <w:sz w:val="20"/>
+              </w:rPr>
+              <w:t xml:space="preserve">Postcondición</w:t>
+            </w:r>
+          </w:p>
+        </w:tc>
+        <w:tc>
+          <w:tcPr>
+            <w:tcW w:type="dxa" w:w="7080"/>
+            <w:vAlign w:val="center"/>
+            <w:tcMar>
+              <w:top w:w="85" w:type="dxa"/>
+              <w:left w:w="100" w:type="dxa"/>
+              <w:bottom w:w="85" w:type="dxa"/>
+              <w:right w:w="100" w:type="dxa"/>
+            </w:tcMar>
+            <w:shd w:fill="FFFFFF"/>
+            <w:tcBorders>
+              <w:top w:val="single" w:sz="4" w:color="D9D9D9"/>
+              <w:left w:val="single" w:sz="4" w:color="D9D9D9"/>
+              <w:bottom w:val="single" w:sz="4" w:color="D9D9D9"/>
+              <w:right w:val="single" w:sz="4" w:color="D9D9D9"/>
+            </w:tcBorders>
+          </w:tcPr>
+          <w:p>
+            <w:pPr>
+              <w:widowControl/>
+              <w:spacing w:after="0" w:line="250" w:lineRule="auto"/>
+              <w:jc w:val="left"/>
+            </w:pPr>
+            <w:r>
+              <w:rPr>
+                <w:rFonts w:ascii="Arial" w:hAnsi="Arial"/>
+                <w:b w:val="0"/>
+                <w:color w:val="111111"/>
+                <w:sz w:val="20"/>
+              </w:rPr>
+              <w:t xml:space="preserve">Tras ejecutar se comprueba el resultado (p. ej. que el commit exista) antes de marcarlo hecho</w:t>
+            </w:r>
+          </w:p>
+        </w:tc>
+      </w:tr>
+      <w:tr>
+        <w:trPr>
+          <w:cantSplit/>
+        </w:trPr>
+        <w:tc>
+          <w:tcPr>
+            <w:tcW w:type="dxa" w:w="3000"/>
+            <w:vAlign w:val="center"/>
+            <w:tcMar>
+              <w:top w:w="85" w:type="dxa"/>
+              <w:left w:w="100" w:type="dxa"/>
+              <w:bottom w:w="85" w:type="dxa"/>
+              <w:right w:w="100" w:type="dxa"/>
+            </w:tcMar>
+            <w:shd w:fill="F0F5F8"/>
+            <w:tcBorders>
+              <w:top w:val="single" w:sz="4" w:color="D9D9D9"/>
+              <w:left w:val="single" w:sz="4" w:color="D9D9D9"/>
+              <w:bottom w:val="single" w:sz="4" w:color="D9D9D9"/>
+              <w:right w:val="single" w:sz="4" w:color="D9D9D9"/>
+            </w:tcBorders>
+          </w:tcPr>
+          <w:p>
+            <w:pPr>
+              <w:widowControl/>
+              <w:spacing w:after="0" w:line="250" w:lineRule="auto"/>
+              <w:jc w:val="left"/>
+            </w:pPr>
+            <w:r>
+              <w:rPr>
+                <w:rFonts w:ascii="Arial" w:hAnsi="Arial"/>
+                <w:b w:val="0"/>
+                <w:color w:val="111111"/>
+                <w:sz w:val="20"/>
+              </w:rPr>
+              <w:t xml:space="preserve">Canales</w:t>
+            </w:r>
+          </w:p>
+        </w:tc>
+        <w:tc>
+          <w:tcPr>
+            <w:tcW w:type="dxa" w:w="7080"/>
+            <w:vAlign w:val="center"/>
+            <w:tcMar>
+              <w:top w:w="85" w:type="dxa"/>
+              <w:left w:w="100" w:type="dxa"/>
+              <w:bottom w:w="85" w:type="dxa"/>
+              <w:right w:w="100" w:type="dxa"/>
+            </w:tcMar>
+            <w:shd w:fill="F0F5F8"/>
+            <w:tcBorders>
+              <w:top w:val="single" w:sz="4" w:color="D9D9D9"/>
+              <w:left w:val="single" w:sz="4" w:color="D9D9D9"/>
+              <w:bottom w:val="single" w:sz="4" w:color="D9D9D9"/>
+              <w:right w:val="single" w:sz="4" w:color="D9D9D9"/>
+            </w:tcBorders>
+          </w:tcPr>
+          <w:p>
+            <w:pPr>
+              <w:widowControl/>
+              <w:spacing w:after="0" w:line="250" w:lineRule="auto"/>
+              <w:jc w:val="left"/>
+            </w:pPr>
+            <w:r>
+              <w:rPr>
+                <w:rFonts w:ascii="Arial" w:hAnsi="Arial"/>
+                <w:b w:val="0"/>
+                <w:color w:val="111111"/>
+                <w:sz w:val="20"/>
+              </w:rPr>
+              <w:t xml:space="preserve">UI y CLI directos; MCP exige el código fuera de banda</w:t>
+            </w:r>
+          </w:p>
+        </w:tc>
+      </w:tr>
+    </w:tbl>
+    <w:p/>
+    <w:p>
+      <w:pPr>
+        <w:pStyle w:val="Heading1"/>
+      </w:pPr>
+      <w:r>
+        <w:rPr>
+          <w:color w:val="000000"/>
+        </w:rPr>
+        <w:t xml:space="preserve">33 El asesor</w:t>
+      </w:r>
+    </w:p>
+    <w:p>
+      <w:r>
+        <w:t xml:space="preserve">Nemotron actúa como capa correctiva sin poder de escritura propio. Responde en JSON estricto; cada intervención nombra su disparador y su evidencia y se valida contra el estado vivo (tarea conocida, no terminal, dentro del alcance).</w:t>
+      </w:r>
+    </w:p>
+    <w:tbl>
+      <w:tblPr>
+        <w:tblW w:type="auto" w:w="0"/>
+        <w:jc w:val="center"/>
+        <w:tblLayout w:type="fixed"/>
+        <w:tblLook w:firstColumn="1" w:firstRow="1" w:lastColumn="0" w:lastRow="0" w:noHBand="0" w:noVBand="1" w:val="04A0"/>
+      </w:tblPr>
+      <w:tblGrid>
+        <w:gridCol w:w="2200"/>
+        <w:gridCol w:w="7880"/>
+      </w:tblGrid>
+      <w:tr>
+        <w:trPr>
+          <w:tblHeader/>
+        </w:trPr>
+        <w:tc>
+          <w:tcPr>
+            <w:tcW w:type="dxa" w:w="2200"/>
+            <w:vAlign w:val="center"/>
+            <w:tcMar>
+              <w:top w:w="85" w:type="dxa"/>
+              <w:left w:w="100" w:type="dxa"/>
+              <w:bottom w:w="85" w:type="dxa"/>
+              <w:right w:w="100" w:type="dxa"/>
+            </w:tcMar>
+            <w:shd w:fill="183A52"/>
+            <w:tcBorders>
+              <w:top w:val="single" w:sz="4" w:color="D9D9D9"/>
+              <w:left w:val="single" w:sz="4" w:color="D9D9D9"/>
+              <w:bottom w:val="single" w:sz="4" w:color="D9D9D9"/>
+              <w:right w:val="single" w:sz="4" w:color="D9D9D9"/>
+            </w:tcBorders>
+          </w:tcPr>
+          <w:p>
+            <w:pPr>
+              <w:widowControl/>
+              <w:spacing w:after="0" w:line="250" w:lineRule="auto"/>
+              <w:jc w:val="left"/>
+            </w:pPr>
+            <w:r>
+              <w:rPr>
+                <w:rFonts w:ascii="Arial" w:hAnsi="Arial"/>
+                <w:b/>
+                <w:color w:val="FFFFFF"/>
+                <w:sz w:val="20"/>
+              </w:rPr>
+              <w:t xml:space="preserve">Intervención</w:t>
+            </w:r>
+          </w:p>
+        </w:tc>
+        <w:tc>
+          <w:tcPr>
+            <w:tcW w:type="dxa" w:w="7880"/>
+            <w:vAlign w:val="center"/>
+            <w:tcMar>
+              <w:top w:w="85" w:type="dxa"/>
+              <w:left w:w="100" w:type="dxa"/>
+              <w:bottom w:w="85" w:type="dxa"/>
+              <w:right w:w="100" w:type="dxa"/>
+            </w:tcMar>
+            <w:shd w:fill="183A52"/>
+            <w:tcBorders>
+              <w:top w:val="single" w:sz="4" w:color="D9D9D9"/>
+              <w:left w:val="single" w:sz="4" w:color="D9D9D9"/>
+              <w:bottom w:val="single" w:sz="4" w:color="D9D9D9"/>
+              <w:right w:val="single" w:sz="4" w:color="D9D9D9"/>
+            </w:tcBorders>
+          </w:tcPr>
+          <w:p>
+            <w:pPr>
+              <w:widowControl/>
+              <w:spacing w:after="0" w:line="250" w:lineRule="auto"/>
+              <w:jc w:val="left"/>
+            </w:pPr>
+            <w:r>
+              <w:rPr>
+                <w:rFonts w:ascii="Arial" w:hAnsi="Arial"/>
+                <w:b/>
+                <w:color w:val="FFFFFF"/>
+                <w:sz w:val="20"/>
+              </w:rPr>
+              <w:t xml:space="preserve">Efecto</w:t>
+            </w:r>
+          </w:p>
+        </w:tc>
+      </w:tr>
+      <w:tr>
+        <w:trPr>
+          <w:cantSplit/>
+        </w:trPr>
+        <w:tc>
+          <w:tcPr>
+            <w:tcW w:type="dxa" w:w="2200"/>
+            <w:vAlign w:val="center"/>
+            <w:tcMar>
+              <w:top w:w="85" w:type="dxa"/>
+              <w:left w:w="100" w:type="dxa"/>
+              <w:bottom w:w="85" w:type="dxa"/>
+              <w:right w:w="100" w:type="dxa"/>
+            </w:tcMar>
+            <w:shd w:fill="F0F5F8"/>
+            <w:tcBorders>
+              <w:top w:val="single" w:sz="4" w:color="D9D9D9"/>
+              <w:left w:val="single" w:sz="4" w:color="D9D9D9"/>
+              <w:bottom w:val="single" w:sz="4" w:color="D9D9D9"/>
+              <w:right w:val="single" w:sz="4" w:color="D9D9D9"/>
+            </w:tcBorders>
+          </w:tcPr>
+          <w:p>
+            <w:pPr>
+              <w:widowControl/>
+              <w:spacing w:after="0" w:line="250" w:lineRule="auto"/>
+              <w:jc w:val="left"/>
+            </w:pPr>
+            <w:r>
+              <w:rPr>
+                <w:rFonts w:ascii="Arial" w:hAnsi="Arial"/>
+                <w:b w:val="0"/>
+                <w:color w:val="111111"/>
+                <w:sz w:val="20"/>
+              </w:rPr>
+              <w:t xml:space="preserve">inject_note</w:t>
+            </w:r>
+          </w:p>
+        </w:tc>
+        <w:tc>
+          <w:tcPr>
+            <w:tcW w:type="dxa" w:w="7880"/>
+            <w:vAlign w:val="center"/>
+            <w:tcMar>
+              <w:top w:w="85" w:type="dxa"/>
+              <w:left w:w="100" w:type="dxa"/>
+              <w:bottom w:w="85" w:type="dxa"/>
+              <w:right w:w="100" w:type="dxa"/>
+            </w:tcMar>
+            <w:shd w:fill="F0F5F8"/>
+            <w:tcBorders>
+              <w:top w:val="single" w:sz="4" w:color="D9D9D9"/>
+              <w:left w:val="single" w:sz="4" w:color="D9D9D9"/>
+              <w:bottom w:val="single" w:sz="4" w:color="D9D9D9"/>
+              <w:right w:val="single" w:sz="4" w:color="D9D9D9"/>
+            </w:tcBorders>
+          </w:tcPr>
+          <w:p>
+            <w:pPr>
+              <w:widowControl/>
+              <w:spacing w:after="0" w:line="250" w:lineRule="auto"/>
+              <w:jc w:val="left"/>
+            </w:pPr>
+            <w:r>
+              <w:rPr>
+                <w:rFonts w:ascii="Arial" w:hAnsi="Arial"/>
+                <w:b w:val="0"/>
+                <w:color w:val="111111"/>
+                <w:sz w:val="20"/>
+              </w:rPr>
+              <w:t xml:space="preserve">La nota llega al siguiente intento de cualquier adaptador y entre turnos del bucle nativo</w:t>
+            </w:r>
+          </w:p>
+        </w:tc>
+      </w:tr>
+      <w:tr>
+        <w:trPr>
+          <w:cantSplit/>
+        </w:trPr>
+        <w:tc>
+          <w:tcPr>
+            <w:tcW w:type="dxa" w:w="2200"/>
+            <w:vAlign w:val="center"/>
+            <w:tcMar>
+              <w:top w:w="85" w:type="dxa"/>
+              <w:left w:w="100" w:type="dxa"/>
+              <w:bottom w:w="85" w:type="dxa"/>
+              <w:right w:w="100" w:type="dxa"/>
+            </w:tcMar>
+            <w:shd w:fill="FFFFFF"/>
+            <w:tcBorders>
+              <w:top w:val="single" w:sz="4" w:color="D9D9D9"/>
+              <w:left w:val="single" w:sz="4" w:color="D9D9D9"/>
+              <w:bottom w:val="single" w:sz="4" w:color="D9D9D9"/>
+              <w:right w:val="single" w:sz="4" w:color="D9D9D9"/>
+            </w:tcBorders>
+          </w:tcPr>
+          <w:p>
+            <w:pPr>
+              <w:widowControl/>
+              <w:spacing w:after="0" w:line="250" w:lineRule="auto"/>
+              <w:jc w:val="left"/>
+            </w:pPr>
+            <w:r>
+              <w:rPr>
+                <w:rFonts w:ascii="Arial" w:hAnsi="Arial"/>
+                <w:b w:val="0"/>
+                <w:color w:val="111111"/>
+                <w:sz w:val="20"/>
+              </w:rPr>
+              <w:t xml:space="preserve">hold</w:t>
+            </w:r>
+          </w:p>
+        </w:tc>
+        <w:tc>
+          <w:tcPr>
+            <w:tcW w:type="dxa" w:w="7880"/>
+            <w:vAlign w:val="center"/>
+            <w:tcMar>
+              <w:top w:w="85" w:type="dxa"/>
+              <w:left w:w="100" w:type="dxa"/>
+              <w:bottom w:w="85" w:type="dxa"/>
+              <w:right w:w="100" w:type="dxa"/>
+            </w:tcMar>
+            <w:shd w:fill="FFFFFF"/>
+            <w:tcBorders>
+              <w:top w:val="single" w:sz="4" w:color="D9D9D9"/>
+              <w:left w:val="single" w:sz="4" w:color="D9D9D9"/>
+              <w:bottom w:val="single" w:sz="4" w:color="D9D9D9"/>
+              <w:right w:val="single" w:sz="4" w:color="D9D9D9"/>
+            </w:tcBorders>
+          </w:tcPr>
+          <w:p>
+            <w:pPr>
+              <w:widowControl/>
+              <w:spacing w:after="0" w:line="250" w:lineRule="auto"/>
+              <w:jc w:val="left"/>
+            </w:pPr>
+            <w:r>
+              <w:rPr>
+                <w:rFonts w:ascii="Arial" w:hAnsi="Arial"/>
+                <w:b w:val="0"/>
+                <w:color w:val="111111"/>
+                <w:sz w:val="20"/>
+              </w:rPr>
+              <w:t xml:space="preserve">Detiene la admisión y el bucle de una tarea hasta liberarla</w:t>
+            </w:r>
+          </w:p>
+        </w:tc>
+      </w:tr>
+      <w:tr>
+        <w:trPr>
+          <w:cantSplit/>
+        </w:trPr>
+        <w:tc>
+          <w:tcPr>
+            <w:tcW w:type="dxa" w:w="2200"/>
+            <w:vAlign w:val="center"/>
+            <w:tcMar>
+              <w:top w:w="85" w:type="dxa"/>
+              <w:left w:w="100" w:type="dxa"/>
+              <w:bottom w:w="85" w:type="dxa"/>
+              <w:right w:w="100" w:type="dxa"/>
+            </w:tcMar>
+            <w:shd w:fill="F0F5F8"/>
+            <w:tcBorders>
+              <w:top w:val="single" w:sz="4" w:color="D9D9D9"/>
+              <w:left w:val="single" w:sz="4" w:color="D9D9D9"/>
+              <w:bottom w:val="single" w:sz="4" w:color="D9D9D9"/>
+              <w:right w:val="single" w:sz="4" w:color="D9D9D9"/>
+            </w:tcBorders>
+          </w:tcPr>
+          <w:p>
+            <w:pPr>
+              <w:widowControl/>
+              <w:spacing w:after="0" w:line="250" w:lineRule="auto"/>
+              <w:jc w:val="left"/>
+            </w:pPr>
+            <w:r>
+              <w:rPr>
+                <w:rFonts w:ascii="Arial" w:hAnsi="Arial"/>
+                <w:b w:val="0"/>
+                <w:color w:val="111111"/>
+                <w:sz w:val="20"/>
+              </w:rPr>
+              <w:t xml:space="preserve">escalate</w:t>
+            </w:r>
+          </w:p>
+        </w:tc>
+        <w:tc>
+          <w:tcPr>
+            <w:tcW w:type="dxa" w:w="7880"/>
+            <w:vAlign w:val="center"/>
+            <w:tcMar>
+              <w:top w:w="85" w:type="dxa"/>
+              <w:left w:w="100" w:type="dxa"/>
+              <w:bottom w:w="85" w:type="dxa"/>
+              <w:right w:w="100" w:type="dxa"/>
+            </w:tcMar>
+            <w:shd w:fill="F0F5F8"/>
+            <w:tcBorders>
+              <w:top w:val="single" w:sz="4" w:color="D9D9D9"/>
+              <w:left w:val="single" w:sz="4" w:color="D9D9D9"/>
+              <w:bottom w:val="single" w:sz="4" w:color="D9D9D9"/>
+              <w:right w:val="single" w:sz="4" w:color="D9D9D9"/>
+            </w:tcBorders>
+          </w:tcPr>
+          <w:p>
+            <w:pPr>
+              <w:widowControl/>
+              <w:spacing w:after="0" w:line="250" w:lineRule="auto"/>
+              <w:jc w:val="left"/>
+            </w:pPr>
+            <w:r>
+              <w:rPr>
+                <w:rFonts w:ascii="Arial" w:hAnsi="Arial"/>
+                <w:b w:val="0"/>
+                <w:color w:val="111111"/>
+                <w:sz w:val="20"/>
+              </w:rPr>
+              <w:t xml:space="preserve">Evita el perfil que falló y sube el piso de nivel</w:t>
+            </w:r>
+          </w:p>
+        </w:tc>
+      </w:tr>
+      <w:tr>
+        <w:trPr>
+          <w:cantSplit/>
+        </w:trPr>
+        <w:tc>
+          <w:tcPr>
+            <w:tcW w:type="dxa" w:w="2200"/>
+            <w:vAlign w:val="center"/>
+            <w:tcMar>
+              <w:top w:w="85" w:type="dxa"/>
+              <w:left w:w="100" w:type="dxa"/>
+              <w:bottom w:w="85" w:type="dxa"/>
+              <w:right w:w="100" w:type="dxa"/>
+            </w:tcMar>
+            <w:shd w:fill="FFFFFF"/>
+            <w:tcBorders>
+              <w:top w:val="single" w:sz="4" w:color="D9D9D9"/>
+              <w:left w:val="single" w:sz="4" w:color="D9D9D9"/>
+              <w:bottom w:val="single" w:sz="4" w:color="D9D9D9"/>
+              <w:right w:val="single" w:sz="4" w:color="D9D9D9"/>
+            </w:tcBorders>
+          </w:tcPr>
+          <w:p>
+            <w:pPr>
+              <w:widowControl/>
+              <w:spacing w:after="0" w:line="250" w:lineRule="auto"/>
+              <w:jc w:val="left"/>
+            </w:pPr>
+            <w:r>
+              <w:rPr>
+                <w:rFonts w:ascii="Arial" w:hAnsi="Arial"/>
+                <w:b w:val="0"/>
+                <w:color w:val="111111"/>
+                <w:sz w:val="20"/>
+              </w:rPr>
+              <w:t xml:space="preserve">replan</w:t>
+            </w:r>
+          </w:p>
+        </w:tc>
+        <w:tc>
+          <w:tcPr>
+            <w:tcW w:type="dxa" w:w="7880"/>
+            <w:vAlign w:val="center"/>
+            <w:tcMar>
+              <w:top w:w="85" w:type="dxa"/>
+              <w:left w:w="100" w:type="dxa"/>
+              <w:bottom w:w="85" w:type="dxa"/>
+              <w:right w:w="100" w:type="dxa"/>
+            </w:tcMar>
+            <w:shd w:fill="FFFFFF"/>
+            <w:tcBorders>
+              <w:top w:val="single" w:sz="4" w:color="D9D9D9"/>
+              <w:left w:val="single" w:sz="4" w:color="D9D9D9"/>
+              <w:bottom w:val="single" w:sz="4" w:color="D9D9D9"/>
+              <w:right w:val="single" w:sz="4" w:color="D9D9D9"/>
+            </w:tcBorders>
+          </w:tcPr>
+          <w:p>
+            <w:pPr>
+              <w:widowControl/>
+              <w:spacing w:after="0" w:line="250" w:lineRule="auto"/>
+              <w:jc w:val="left"/>
+            </w:pPr>
+            <w:r>
+              <w:rPr>
+                <w:rFonts w:ascii="Arial" w:hAnsi="Arial"/>
+                <w:b w:val="0"/>
+                <w:color w:val="111111"/>
+                <w:sz w:val="20"/>
+              </w:rPr>
+              <w:t xml:space="preserve">Parte la tarea con el mismo validador de delegación, sustituye la original y reengancha a sus dependientes</w:t>
+            </w:r>
+          </w:p>
+        </w:tc>
+      </w:tr>
+      <w:tr>
+        <w:trPr>
+          <w:cantSplit/>
+        </w:trPr>
+        <w:tc>
+          <w:tcPr>
+            <w:tcW w:type="dxa" w:w="2200"/>
+            <w:vAlign w:val="center"/>
+            <w:tcMar>
+              <w:top w:w="85" w:type="dxa"/>
+              <w:left w:w="100" w:type="dxa"/>
+              <w:bottom w:w="85" w:type="dxa"/>
+              <w:right w:w="100" w:type="dxa"/>
+            </w:tcMar>
+            <w:shd w:fill="F0F5F8"/>
+            <w:tcBorders>
+              <w:top w:val="single" w:sz="4" w:color="D9D9D9"/>
+              <w:left w:val="single" w:sz="4" w:color="D9D9D9"/>
+              <w:bottom w:val="single" w:sz="4" w:color="D9D9D9"/>
+              <w:right w:val="single" w:sz="4" w:color="D9D9D9"/>
+            </w:tcBorders>
+          </w:tcPr>
+          <w:p>
+            <w:pPr>
+              <w:widowControl/>
+              <w:spacing w:after="0" w:line="250" w:lineRule="auto"/>
+              <w:jc w:val="left"/>
+            </w:pPr>
+            <w:r>
+              <w:rPr>
+                <w:rFonts w:ascii="Arial" w:hAnsi="Arial"/>
+                <w:b w:val="0"/>
+                <w:color w:val="111111"/>
+                <w:sz w:val="20"/>
+              </w:rPr>
+              <w:t xml:space="preserve">rollback</w:t>
+            </w:r>
+          </w:p>
+        </w:tc>
+        <w:tc>
+          <w:tcPr>
+            <w:tcW w:type="dxa" w:w="7880"/>
+            <w:vAlign w:val="center"/>
+            <w:tcMar>
+              <w:top w:w="85" w:type="dxa"/>
+              <w:left w:w="100" w:type="dxa"/>
+              <w:bottom w:w="85" w:type="dxa"/>
+              <w:right w:w="100" w:type="dxa"/>
+            </w:tcMar>
+            <w:shd w:fill="F0F5F8"/>
+            <w:tcBorders>
+              <w:top w:val="single" w:sz="4" w:color="D9D9D9"/>
+              <w:left w:val="single" w:sz="4" w:color="D9D9D9"/>
+              <w:bottom w:val="single" w:sz="4" w:color="D9D9D9"/>
+              <w:right w:val="single" w:sz="4" w:color="D9D9D9"/>
+            </w:tcBorders>
+          </w:tcPr>
+          <w:p>
+            <w:pPr>
+              <w:widowControl/>
+              <w:spacing w:after="0" w:line="250" w:lineRule="auto"/>
+              <w:jc w:val="left"/>
+            </w:pPr>
+            <w:r>
+              <w:rPr>
+                <w:rFonts w:ascii="Arial" w:hAnsi="Arial"/>
+                <w:b w:val="0"/>
+                <w:color w:val="111111"/>
+                <w:sz w:val="20"/>
+              </w:rPr>
+              <w:t xml:space="preserve">Abre una compuerta humana; aprobado, revierte con acciones compensatorias solo sobre lo que sigue siendo exactamente lo que la tarea dejó</w:t>
+            </w:r>
+          </w:p>
+        </w:tc>
+      </w:tr>
+      <w:tr>
+        <w:trPr>
+          <w:cantSplit/>
+        </w:trPr>
+        <w:tc>
+          <w:tcPr>
+            <w:tcW w:type="dxa" w:w="2200"/>
+            <w:vAlign w:val="center"/>
+            <w:tcMar>
+              <w:top w:w="85" w:type="dxa"/>
+              <w:left w:w="100" w:type="dxa"/>
+              <w:bottom w:w="85" w:type="dxa"/>
+              <w:right w:w="100" w:type="dxa"/>
+            </w:tcMar>
+            <w:shd w:fill="FFFFFF"/>
+            <w:tcBorders>
+              <w:top w:val="single" w:sz="4" w:color="D9D9D9"/>
+              <w:left w:val="single" w:sz="4" w:color="D9D9D9"/>
+              <w:bottom w:val="single" w:sz="4" w:color="D9D9D9"/>
+              <w:right w:val="single" w:sz="4" w:color="D9D9D9"/>
+            </w:tcBorders>
+          </w:tcPr>
+          <w:p>
+            <w:pPr>
+              <w:widowControl/>
+              <w:spacing w:after="0" w:line="250" w:lineRule="auto"/>
+              <w:jc w:val="left"/>
+            </w:pPr>
+            <w:r>
+              <w:rPr>
+                <w:rFonts w:ascii="Arial" w:hAnsi="Arial"/>
+                <w:b w:val="0"/>
+                <w:color w:val="111111"/>
+                <w:sz w:val="20"/>
+              </w:rPr>
+              <w:t xml:space="preserve">pushback</w:t>
+            </w:r>
+          </w:p>
+        </w:tc>
+        <w:tc>
+          <w:tcPr>
+            <w:tcW w:type="dxa" w:w="7880"/>
+            <w:vAlign w:val="center"/>
+            <w:tcMar>
+              <w:top w:w="85" w:type="dxa"/>
+              <w:left w:w="100" w:type="dxa"/>
+              <w:bottom w:w="85" w:type="dxa"/>
+              <w:right w:w="100" w:type="dxa"/>
+            </w:tcMar>
+            <w:shd w:fill="FFFFFF"/>
+            <w:tcBorders>
+              <w:top w:val="single" w:sz="4" w:color="D9D9D9"/>
+              <w:left w:val="single" w:sz="4" w:color="D9D9D9"/>
+              <w:bottom w:val="single" w:sz="4" w:color="D9D9D9"/>
+              <w:right w:val="single" w:sz="4" w:color="D9D9D9"/>
+            </w:tcBorders>
+          </w:tcPr>
+          <w:p>
+            <w:pPr>
+              <w:widowControl/>
+              <w:spacing w:after="0" w:line="250" w:lineRule="auto"/>
+              <w:jc w:val="left"/>
+            </w:pPr>
+            <w:r>
+              <w:rPr>
+                <w:rFonts w:ascii="Arial" w:hAnsi="Arial"/>
+                <w:b w:val="0"/>
+                <w:color w:val="111111"/>
+                <w:sz w:val="20"/>
+              </w:rPr>
+              <w:t xml:space="preserve">Supuestos de la tarea → búsquedas con la guarda de salida → hallazgos que solo citan fuentes recuperadas → tarea retenida a la espera de una decisión humana</w:t>
+            </w:r>
+          </w:p>
+        </w:tc>
+      </w:tr>
+    </w:tbl>
+    <w:p/>
+    <w:p>
+      <w:r>
+        <w:t xml:space="preserve">Presupuestos de consultas e intervenciones por tarea se cuentan desde el ledger; preguntar no cambia nada: proponer y aplicar son pasos separados y registrados.</w:t>
+      </w:r>
+    </w:p>
+    <w:p>
+      <w:pPr>
+        <w:pStyle w:val="Heading1"/>
+      </w:pPr>
+      <w:r>
+        <w:rPr>
+          <w:color w:val="000000"/>
+        </w:rPr>
+        <w:t xml:space="preserve">34 Niveles, escalera, pools y agentes configurables</w:t>
+      </w:r>
+    </w:p>
+    <w:p>
+      <w:pPr>
+        <w:pStyle w:val="ListBullet"/>
+      </w:pPr>
+      <w:r>
+        <w:t xml:space="preserve">Cada perfil declara un nivel: cheap (tareas puntuales), standard (construcción), advanced (investigación, revisión, decisiones difíciles). El planificador marca el nivel de cada tarea.</w:t>
+      </w:r>
+    </w:p>
+    <w:p>
+      <w:pPr>
+        <w:pStyle w:val="ListBullet"/>
+      </w:pPr>
+      <w:r>
+        <w:t xml:space="preserve">El enrutador usa el nivel más bajo que cumpla el piso pedido: nunca paga más de lo necesario.</w:t>
+      </w:r>
+    </w:p>
+    <w:p>
+      <w:pPr>
+        <w:pStyle w:val="ListBullet"/>
+      </w:pPr>
+      <w:r>
+        <w:t xml:space="preserve">Escalera: cada intento fallido sube el piso un nivel; es finita (tres peldaños) y cada reintento queda en el ledger.</w:t>
+      </w:r>
+    </w:p>
+    <w:p>
+      <w:pPr>
+        <w:pStyle w:val="ListBullet"/>
+      </w:pPr>
+      <w:r>
+        <w:t xml:space="preserve">Pools: grupos de agentes con concurrencia máxima, en orden FIFO; un trabajo que falla libera su cupo.</w:t>
+      </w:r>
+    </w:p>
+    <w:p>
+      <w:pPr>
+        <w:pStyle w:val="ListBullet"/>
+      </w:pPr>
+      <w:r>
+        <w:t xml:space="preserve">Configuración: extender un perfil integrado, apuntar a cualquier endpoint compatible con OpenAI (otro modelo, un servidor local; mismo bucle y ejecutor) o envolver cualquier CLI. Un archivo inválido se rechaza entero, con todos los problemas.</w:t>
+      </w:r>
+    </w:p>
+    <w:p>
+      <w:pPr>
+        <w:pStyle w:val="ListBullet"/>
+      </w:pPr>
+      <w:r>
+        <w:t xml:space="preserve">synapser doctor sondea qué está instalado y es usable y sugiere qué habilitar, sin habilitar nada.</w:t>
+      </w:r>
+    </w:p>
+    <w:p>
+      <w:pPr>
+        <w:pStyle w:val="ListBullet"/>
+      </w:pPr>
+      <w:r>
+        <w:t xml:space="preserve">El costo se aprende del historial de corridas anteriores; sin datos suficientes es desconocido y alerta, como antes.</w:t>
+      </w:r>
+    </w:p>
+    <w:p>
+      <w:pPr>
+        <w:pStyle w:val="Heading1"/>
+      </w:pPr>
+      <w:r>
+        <w:rPr>
+          <w:color w:val="000000"/>
+        </w:rPr>
+        <w:t xml:space="preserve">35 Chat e interfaz</w:t>
+      </w:r>
+    </w:p>
+    <w:p>
+      <w:r>
+        <w:t xml:space="preserve">El chat es la interfaz conversacional de Nemotron para pedir workflows. Sus herramientas son solo redactar un borrador, editarlo, listar, explicar, mostrar compuertas, listar agentes y consultar al asesor.</w:t>
+      </w:r>
+    </w:p>
+    <w:p>
+      <w:pPr>
+        <w:pStyle w:val="ListBullet"/>
+      </w:pPr>
+      <w:r>
+        <w:t xml:space="preserve">H1: no existe herramienta para iniciar, cancelar, aprobar ni aplicar; esas son acciones del operador desde la consola.</w:t>
+      </w:r>
+    </w:p>
+    <w:p>
+      <w:pPr>
+        <w:pStyle w:val="ListBullet"/>
+      </w:pPr>
+      <w:r>
+        <w:t xml:space="preserve">H2: los borradores pasan por el mismo validador que la API; los errores vuelven al modelo, que corrige.</w:t>
+      </w:r>
+    </w:p>
+    <w:p>
+      <w:pPr>
+        <w:pStyle w:val="ListBullet"/>
+      </w:pPr>
+      <w:r>
+        <w:t xml:space="preserve">H3: los hechos sobre una corrida citan el seq del ledger de donde salen; la conversación misma son eventos del ledger.</w:t>
+      </w:r>
+    </w:p>
+    <w:p>
+      <w:pPr>
+        <w:pStyle w:val="ListBullet"/>
+      </w:pPr>
+      <w:r>
+        <w:t xml:space="preserve">API: /api/workflows, /api/chat, /api/catalog, /api/config. Las escrituras exigen token de sesión y mismo origen; el actor es fijo; el servidor sigue sin ruta al ejecutor. Se lanza con synapser serve.</w:t>
+      </w:r>
+    </w:p>
+    <w:p>
+      <w:pPr>
+        <w:pStyle w:val="ListBullet"/>
+      </w:pPr>
+      <w:r>
+        <w:t xml:space="preserve">Vistas nuevas: Chat, Workflows (condiciones con estado y evidencia, iniciar y cancelar) y Agentes (nivel, capacidades, pool, costo, política).</w:t>
+      </w:r>
+    </w:p>
+    <w:p>
+      <w:pPr>
+        <w:pStyle w:val="Heading1"/>
+      </w:pPr>
+      <w:r>
+        <w:rPr>
+          <w:color w:val="000000"/>
+        </w:rPr>
+        <w:t xml:space="preserve">36 Límites declarados del centro de mando</w:t>
+      </w:r>
+    </w:p>
+    <w:tbl>
+      <w:tblPr>
+        <w:tblW w:type="auto" w:w="0"/>
+        <w:jc w:val="center"/>
+        <w:tblLayout w:type="fixed"/>
+        <w:tblLook w:firstColumn="1" w:firstRow="1" w:lastColumn="0" w:lastRow="0" w:noHBand="0" w:noVBand="1" w:val="04A0"/>
+      </w:tblPr>
+      <w:tblGrid>
+        <w:gridCol w:w="5000"/>
+        <w:gridCol w:w="5080"/>
+      </w:tblGrid>
+      <w:tr>
+        <w:trPr>
+          <w:tblHeader/>
+        </w:trPr>
+        <w:tc>
+          <w:tcPr>
+            <w:tcW w:type="dxa" w:w="5000"/>
+            <w:vAlign w:val="center"/>
+            <w:tcMar>
+              <w:top w:w="85" w:type="dxa"/>
+              <w:left w:w="100" w:type="dxa"/>
+              <w:bottom w:w="85" w:type="dxa"/>
+              <w:right w:w="100" w:type="dxa"/>
+            </w:tcMar>
+            <w:shd w:fill="183A52"/>
+            <w:tcBorders>
+              <w:top w:val="single" w:sz="4" w:color="D9D9D9"/>
+              <w:left w:val="single" w:sz="4" w:color="D9D9D9"/>
+              <w:bottom w:val="single" w:sz="4" w:color="D9D9D9"/>
+              <w:right w:val="single" w:sz="4" w:color="D9D9D9"/>
+            </w:tcBorders>
+          </w:tcPr>
+          <w:p>
+            <w:pPr>
+              <w:widowControl/>
+              <w:spacing w:after="0" w:line="250" w:lineRule="auto"/>
+              <w:jc w:val="left"/>
+            </w:pPr>
+            <w:r>
+              <w:rPr>
+                <w:rFonts w:ascii="Arial" w:hAnsi="Arial"/>
+                <w:b/>
+                <w:color w:val="FFFFFF"/>
+                <w:sz w:val="20"/>
+              </w:rPr>
+              <w:t xml:space="preserve">Límite</w:t>
+            </w:r>
+          </w:p>
+        </w:tc>
+        <w:tc>
+          <w:tcPr>
+            <w:tcW w:type="dxa" w:w="5080"/>
+            <w:vAlign w:val="center"/>
+            <w:tcMar>
+              <w:top w:w="85" w:type="dxa"/>
+              <w:left w:w="100" w:type="dxa"/>
+              <w:bottom w:w="85" w:type="dxa"/>
+              <w:right w:w="100" w:type="dxa"/>
+            </w:tcMar>
+            <w:shd w:fill="183A52"/>
+            <w:tcBorders>
+              <w:top w:val="single" w:sz="4" w:color="D9D9D9"/>
+              <w:left w:val="single" w:sz="4" w:color="D9D9D9"/>
+              <w:bottom w:val="single" w:sz="4" w:color="D9D9D9"/>
+              <w:right w:val="single" w:sz="4" w:color="D9D9D9"/>
+            </w:tcBorders>
+          </w:tcPr>
+          <w:p>
+            <w:pPr>
+              <w:widowControl/>
+              <w:spacing w:after="0" w:line="250" w:lineRule="auto"/>
+              <w:jc w:val="left"/>
+            </w:pPr>
+            <w:r>
+              <w:rPr>
+                <w:rFonts w:ascii="Arial" w:hAnsi="Arial"/>
+                <w:b/>
+                <w:color w:val="FFFFFF"/>
+                <w:sz w:val="20"/>
+              </w:rPr>
+              <w:t xml:space="preserve">Tratamiento</w:t>
+            </w:r>
+          </w:p>
+        </w:tc>
+      </w:tr>
+      <w:tr>
+        <w:trPr>
+          <w:cantSplit/>
+        </w:trPr>
+        <w:tc>
+          <w:tcPr>
+            <w:tcW w:type="dxa" w:w="5000"/>
+            <w:vAlign w:val="center"/>
+            <w:tcMar>
+              <w:top w:w="85" w:type="dxa"/>
+              <w:left w:w="100" w:type="dxa"/>
+              <w:bottom w:w="85" w:type="dxa"/>
+              <w:right w:w="100" w:type="dxa"/>
+            </w:tcMar>
+            <w:shd w:fill="F0F5F8"/>
+            <w:tcBorders>
+              <w:top w:val="single" w:sz="4" w:color="D9D9D9"/>
+              <w:left w:val="single" w:sz="4" w:color="D9D9D9"/>
+              <w:bottom w:val="single" w:sz="4" w:color="D9D9D9"/>
+              <w:right w:val="single" w:sz="4" w:color="D9D9D9"/>
+            </w:tcBorders>
+          </w:tcPr>
+          <w:p>
+            <w:pPr>
+              <w:widowControl/>
+              <w:spacing w:after="0" w:line="250" w:lineRule="auto"/>
+              <w:jc w:val="left"/>
+            </w:pPr>
+            <w:r>
+              <w:rPr>
+                <w:rFonts w:ascii="Arial" w:hAnsi="Arial"/>
+                <w:b w:val="0"/>
+                <w:color w:val="111111"/>
+                <w:sz w:val="20"/>
+              </w:rPr>
+              <w:t xml:space="preserve">Un agente con red puede exfiltrar los secretos que tenga; quitamos secretos, no la red</w:t>
+            </w:r>
+          </w:p>
+        </w:tc>
+        <w:tc>
+          <w:tcPr>
+            <w:tcW w:type="dxa" w:w="5080"/>
+            <w:vAlign w:val="center"/>
+            <w:tcMar>
+              <w:top w:w="85" w:type="dxa"/>
+              <w:left w:w="100" w:type="dxa"/>
+              <w:bottom w:w="85" w:type="dxa"/>
+              <w:right w:w="100" w:type="dxa"/>
+            </w:tcMar>
+            <w:shd w:fill="F0F5F8"/>
+            <w:tcBorders>
+              <w:top w:val="single" w:sz="4" w:color="D9D9D9"/>
+              <w:left w:val="single" w:sz="4" w:color="D9D9D9"/>
+              <w:bottom w:val="single" w:sz="4" w:color="D9D9D9"/>
+              <w:right w:val="single" w:sz="4" w:color="D9D9D9"/>
+            </w:tcBorders>
+          </w:tcPr>
+          <w:p>
+            <w:pPr>
+              <w:widowControl/>
+              <w:spacing w:after="0" w:line="250" w:lineRule="auto"/>
+              <w:jc w:val="left"/>
+            </w:pPr>
+            <w:r>
+              <w:rPr>
+                <w:rFonts w:ascii="Arial" w:hAnsi="Arial"/>
+                <w:b w:val="0"/>
+                <w:color w:val="111111"/>
+                <w:sz w:val="20"/>
+              </w:rPr>
+              <w:t xml:space="preserve">Declarado; no se promete aislamiento de red</w:t>
+            </w:r>
+          </w:p>
+        </w:tc>
+      </w:tr>
+      <w:tr>
+        <w:trPr>
+          <w:cantSplit/>
+        </w:trPr>
+        <w:tc>
+          <w:tcPr>
+            <w:tcW w:type="dxa" w:w="5000"/>
+            <w:vAlign w:val="center"/>
+            <w:tcMar>
+              <w:top w:w="85" w:type="dxa"/>
+              <w:left w:w="100" w:type="dxa"/>
+              <w:bottom w:w="85" w:type="dxa"/>
+              <w:right w:w="100" w:type="dxa"/>
+            </w:tcMar>
+            <w:shd w:fill="FFFFFF"/>
+            <w:tcBorders>
+              <w:top w:val="single" w:sz="4" w:color="D9D9D9"/>
+              <w:left w:val="single" w:sz="4" w:color="D9D9D9"/>
+              <w:bottom w:val="single" w:sz="4" w:color="D9D9D9"/>
+              <w:right w:val="single" w:sz="4" w:color="D9D9D9"/>
+            </w:tcBorders>
+          </w:tcPr>
+          <w:p>
+            <w:pPr>
+              <w:widowControl/>
+              <w:spacing w:after="0" w:line="250" w:lineRule="auto"/>
+              <w:jc w:val="left"/>
+            </w:pPr>
+            <w:r>
+              <w:rPr>
+                <w:rFonts w:ascii="Arial" w:hAnsi="Arial"/>
+                <w:b w:val="0"/>
+                <w:color w:val="111111"/>
+                <w:sz w:val="20"/>
+              </w:rPr>
+              <w:t xml:space="preserve">El rollback se ejecuta solo mientras el ejecutor del workflow está vivo</w:t>
+            </w:r>
+          </w:p>
+        </w:tc>
+        <w:tc>
+          <w:tcPr>
+            <w:tcW w:type="dxa" w:w="5080"/>
+            <w:vAlign w:val="center"/>
+            <w:tcMar>
+              <w:top w:w="85" w:type="dxa"/>
+              <w:left w:w="100" w:type="dxa"/>
+              <w:bottom w:w="85" w:type="dxa"/>
+              <w:right w:w="100" w:type="dxa"/>
+            </w:tcMar>
+            <w:shd w:fill="FFFFFF"/>
+            <w:tcBorders>
+              <w:top w:val="single" w:sz="4" w:color="D9D9D9"/>
+              <w:left w:val="single" w:sz="4" w:color="D9D9D9"/>
+              <w:bottom w:val="single" w:sz="4" w:color="D9D9D9"/>
+              <w:right w:val="single" w:sz="4" w:color="D9D9D9"/>
+            </w:tcBorders>
+          </w:tcPr>
+          <w:p>
+            <w:pPr>
+              <w:widowControl/>
+              <w:spacing w:after="0" w:line="250" w:lineRule="auto"/>
+              <w:jc w:val="left"/>
+            </w:pPr>
+            <w:r>
+              <w:rPr>
+                <w:rFonts w:ascii="Arial" w:hAnsi="Arial"/>
+                <w:b w:val="0"/>
+                <w:color w:val="111111"/>
+                <w:sz w:val="20"/>
+              </w:rPr>
+              <w:t xml:space="preserve">Si no, queda propuesto y pendiente</w:t>
+            </w:r>
+          </w:p>
+        </w:tc>
+      </w:tr>
+      <w:tr>
+        <w:trPr>
+          <w:cantSplit/>
+        </w:trPr>
+        <w:tc>
+          <w:tcPr>
+            <w:tcW w:type="dxa" w:w="5000"/>
+            <w:vAlign w:val="center"/>
+            <w:tcMar>
+              <w:top w:w="85" w:type="dxa"/>
+              <w:left w:w="100" w:type="dxa"/>
+              <w:bottom w:w="85" w:type="dxa"/>
+              <w:right w:w="100" w:type="dxa"/>
+            </w:tcMar>
+            <w:shd w:fill="F0F5F8"/>
+            <w:tcBorders>
+              <w:top w:val="single" w:sz="4" w:color="D9D9D9"/>
+              <w:left w:val="single" w:sz="4" w:color="D9D9D9"/>
+              <w:bottom w:val="single" w:sz="4" w:color="D9D9D9"/>
+              <w:right w:val="single" w:sz="4" w:color="D9D9D9"/>
+            </w:tcBorders>
+          </w:tcPr>
+          <w:p>
+            <w:pPr>
+              <w:widowControl/>
+              <w:spacing w:after="0" w:line="250" w:lineRule="auto"/>
+              <w:jc w:val="left"/>
+            </w:pPr>
+            <w:r>
+              <w:rPr>
+                <w:rFonts w:ascii="Arial" w:hAnsi="Arial"/>
+                <w:b w:val="0"/>
+                <w:color w:val="111111"/>
+                <w:sz w:val="20"/>
+              </w:rPr>
+              <w:t xml:space="preserve">Los agentes CLI one-shot no tienen canal de vuelta (subtareas, efectos, MCP)</w:t>
+            </w:r>
+          </w:p>
+        </w:tc>
+        <w:tc>
+          <w:tcPr>
+            <w:tcW w:type="dxa" w:w="5080"/>
+            <w:vAlign w:val="center"/>
+            <w:tcMar>
+              <w:top w:w="85" w:type="dxa"/>
+              <w:left w:w="100" w:type="dxa"/>
+              <w:bottom w:w="85" w:type="dxa"/>
+              <w:right w:w="100" w:type="dxa"/>
+            </w:tcMar>
+            <w:shd w:fill="F0F5F8"/>
+            <w:tcBorders>
+              <w:top w:val="single" w:sz="4" w:color="D9D9D9"/>
+              <w:left w:val="single" w:sz="4" w:color="D9D9D9"/>
+              <w:bottom w:val="single" w:sz="4" w:color="D9D9D9"/>
+              <w:right w:val="single" w:sz="4" w:color="D9D9D9"/>
+            </w:tcBorders>
+          </w:tcPr>
+          <w:p>
+            <w:pPr>
+              <w:widowControl/>
+              <w:spacing w:after="0" w:line="250" w:lineRule="auto"/>
+              <w:jc w:val="left"/>
+            </w:pPr>
+            <w:r>
+              <w:rPr>
+                <w:rFonts w:ascii="Arial" w:hAnsi="Arial"/>
+                <w:b w:val="0"/>
+                <w:color w:val="111111"/>
+                <w:sz w:val="20"/>
+              </w:rPr>
+              <w:t xml:space="preserve">El enlace MCP de trabajador existe en el servidor y no está conectado al lanzamiento de CLI</w:t>
+            </w:r>
+          </w:p>
+        </w:tc>
+      </w:tr>
+      <w:tr>
+        <w:trPr>
+          <w:cantSplit/>
+        </w:trPr>
+        <w:tc>
+          <w:tcPr>
+            <w:tcW w:type="dxa" w:w="5000"/>
+            <w:vAlign w:val="center"/>
+            <w:tcMar>
+              <w:top w:w="85" w:type="dxa"/>
+              <w:left w:w="100" w:type="dxa"/>
+              <w:bottom w:w="85" w:type="dxa"/>
+              <w:right w:w="100" w:type="dxa"/>
+            </w:tcMar>
+            <w:shd w:fill="FFFFFF"/>
+            <w:tcBorders>
+              <w:top w:val="single" w:sz="4" w:color="D9D9D9"/>
+              <w:left w:val="single" w:sz="4" w:color="D9D9D9"/>
+              <w:bottom w:val="single" w:sz="4" w:color="D9D9D9"/>
+              <w:right w:val="single" w:sz="4" w:color="D9D9D9"/>
+            </w:tcBorders>
+          </w:tcPr>
+          <w:p>
+            <w:pPr>
+              <w:widowControl/>
+              <w:spacing w:after="0" w:line="250" w:lineRule="auto"/>
+              <w:jc w:val="left"/>
+            </w:pPr>
+            <w:r>
+              <w:rPr>
+                <w:rFonts w:ascii="Arial" w:hAnsi="Arial"/>
+                <w:b w:val="0"/>
+                <w:color w:val="111111"/>
+                <w:sz w:val="20"/>
+              </w:rPr>
+              <w:t xml:space="preserve">El chat y el asesor dependen de la calidad del modelo</w:t>
+            </w:r>
+          </w:p>
+        </w:tc>
+        <w:tc>
+          <w:tcPr>
+            <w:tcW w:type="dxa" w:w="5080"/>
+            <w:vAlign w:val="center"/>
+            <w:tcMar>
+              <w:top w:w="85" w:type="dxa"/>
+              <w:left w:w="100" w:type="dxa"/>
+              <w:bottom w:w="85" w:type="dxa"/>
+              <w:right w:w="100" w:type="dxa"/>
+            </w:tcMar>
+            <w:shd w:fill="FFFFFF"/>
+            <w:tcBorders>
+              <w:top w:val="single" w:sz="4" w:color="D9D9D9"/>
+              <w:left w:val="single" w:sz="4" w:color="D9D9D9"/>
+              <w:bottom w:val="single" w:sz="4" w:color="D9D9D9"/>
+              <w:right w:val="single" w:sz="4" w:color="D9D9D9"/>
+            </w:tcBorders>
+          </w:tcPr>
+          <w:p>
+            <w:pPr>
+              <w:widowControl/>
+              <w:spacing w:after="0" w:line="250" w:lineRule="auto"/>
+              <w:jc w:val="left"/>
+            </w:pPr>
+            <w:r>
+              <w:rPr>
+                <w:rFonts w:ascii="Arial" w:hAnsi="Arial"/>
+                <w:b w:val="0"/>
+                <w:color w:val="111111"/>
+                <w:sz w:val="20"/>
+              </w:rPr>
+              <w:t xml:space="preserve">Todo lo que proponen pasa por validadores deterministas y compuertas humanas</w:t>
+            </w:r>
+          </w:p>
+        </w:tc>
+      </w:tr>
+      <w:tr>
+        <w:trPr>
+          <w:cantSplit/>
+        </w:trPr>
+        <w:tc>
+          <w:tcPr>
+            <w:tcW w:type="dxa" w:w="5000"/>
+            <w:vAlign w:val="center"/>
+            <w:tcMar>
+              <w:top w:w="85" w:type="dxa"/>
+              <w:left w:w="100" w:type="dxa"/>
+              <w:bottom w:w="85" w:type="dxa"/>
+              <w:right w:w="100" w:type="dxa"/>
+            </w:tcMar>
+            <w:shd w:fill="F0F5F8"/>
+            <w:tcBorders>
+              <w:top w:val="single" w:sz="4" w:color="D9D9D9"/>
+              <w:left w:val="single" w:sz="4" w:color="D9D9D9"/>
+              <w:bottom w:val="single" w:sz="4" w:color="D9D9D9"/>
+              <w:right w:val="single" w:sz="4" w:color="D9D9D9"/>
+            </w:tcBorders>
+          </w:tcPr>
+          <w:p>
+            <w:pPr>
+              <w:widowControl/>
+              <w:spacing w:after="0" w:line="250" w:lineRule="auto"/>
+              <w:jc w:val="left"/>
+            </w:pPr>
+            <w:r>
+              <w:rPr>
+                <w:rFonts w:ascii="Arial" w:hAnsi="Arial"/>
+                <w:b w:val="0"/>
+                <w:color w:val="111111"/>
+                <w:sz w:val="20"/>
+              </w:rPr>
+              <w:t xml:space="preserve">La edición de configuración desde la UI es de solo lectura por ahora</w:t>
+            </w:r>
+          </w:p>
+        </w:tc>
+        <w:tc>
+          <w:tcPr>
+            <w:tcW w:type="dxa" w:w="5080"/>
+            <w:vAlign w:val="center"/>
+            <w:tcMar>
+              <w:top w:w="85" w:type="dxa"/>
+              <w:left w:w="100" w:type="dxa"/>
+              <w:bottom w:w="85" w:type="dxa"/>
+              <w:right w:w="100" w:type="dxa"/>
+            </w:tcMar>
+            <w:shd w:fill="F0F5F8"/>
+            <w:tcBorders>
+              <w:top w:val="single" w:sz="4" w:color="D9D9D9"/>
+              <w:left w:val="single" w:sz="4" w:color="D9D9D9"/>
+              <w:bottom w:val="single" w:sz="4" w:color="D9D9D9"/>
+              <w:right w:val="single" w:sz="4" w:color="D9D9D9"/>
+            </w:tcBorders>
+          </w:tcPr>
+          <w:p>
+            <w:pPr>
+              <w:widowControl/>
+              <w:spacing w:after="0" w:line="250" w:lineRule="auto"/>
+              <w:jc w:val="left"/>
+            </w:pPr>
+            <w:r>
+              <w:rPr>
+                <w:rFonts w:ascii="Arial" w:hAnsi="Arial"/>
+                <w:b w:val="0"/>
+                <w:color w:val="111111"/>
+                <w:sz w:val="20"/>
+              </w:rPr>
+              <w:t xml:space="preserve">La configuración se edita en el archivo; se rechaza entera si es inválida</w:t>
+            </w:r>
+          </w:p>
+        </w:tc>
+      </w:tr>
+    </w:tbl>
+    <w:p/>
     <w:sectPr>
       <w:footerReference w:type="default" r:id="rId9"/>
       <w:pgSz w:w="12240" w:h="15840"/>
@@ -21549,7 +24067,7 @@
         <w:color w:val="505050"/>
         <w:sz w:val="16"/>
       </w:rPr>
-      <w:t xml:space="preserve">Synapser  ·  Diseño 0.3  ·  </w:t>
+      <w:t xml:space="preserve">Synapser  ·  Diseño 0.4  ·  </w:t>
     </w:r>
     <w:fldSimple w:instr="PAGE"/>
   </w:p>

</xml_diff>

<commit_message>
Update the design document to v0.5 with the plan 14 sections
The design document gains sections 37 to 40: what changed in 0.5, the plan 14 status,
the invariants L1 to L6 with where each one is verified, and the limits and open
decisions. The header and footer move to 0.5. The XML was edited directly and checked:
it is well formed, the package is intact, and it converts to PDF.

Co-Authored-By: Claude Haiku 5.5 <noreply@anthropic.com>
</commit_message>
<xml_diff>
--- a/design/Synapser_Diseno.docx
+++ b/design/Synapser_Diseno.docx
@@ -29,7 +29,7 @@
         <w:rPr>
           <w:sz w:val="19"/>
         </w:rPr>
-        <w:t>13 de octubre de 2026  ·  Versión 0.4  ·  Diseño con implementación verificada</w:t>
+        <w:t>14 de octubre de 2026  ·  Versión 0.5  ·  Diseño con implementación verificada</w:t>
       </w:r>
     </w:p>
     <w:p>
@@ -24043,6 +24043,202 @@
       </w:tr>
     </w:tbl>
     <w:p/>
+    <w:p>
+      <w:pPr>
+        <w:pStyle w:val="Heading1"/>
+      </w:pPr>
+      <w:r>
+        <w:t xml:space="preserve">37 Qué cambió en la versión 0.5 (plan 14: diseño desde la UI)</w:t>
+      </w:r>
+    </w:p>
+    <w:p>
+      <w:r>
+        <w:t xml:space="preserve">La versión 0.5 agrega lo que el plan 14 pedía para diseñar desde la consola: adaptadores por agente, biblioteca versionada y la consola de diseño. Cada punto está implementado y cubierto por pruebas automáticas; sus límites están en la sección 40.</w:t>
+      </w:r>
+    </w:p>
+    <w:p>
+      <w:pPr>
+        <w:pStyle w:val="ListBullet"/>
+      </w:pPr>
+      <w:r>
+        <w:t xml:space="preserve">Adaptadores por agente (§1–§2 del plan 14): claude-code, codex, kimi, mimo y generic-cli declaran sus capacidades, y ninguno emite un flag que su tabla no declare.</w:t>
+      </w:r>
+    </w:p>
+    <w:p>
+      <w:pPr>
+        <w:pStyle w:val="ListBullet"/>
+      </w:pPr>
+      <w:r>
+        <w:t xml:space="preserve">Skills inyectadas por mecanismo nativo, con id, digest y mecanismo registrados en la corrida. Una skill no amplía permisos.</w:t>
+      </w:r>
+    </w:p>
+    <w:p>
+      <w:pPr>
+        <w:pStyle w:val="ListBullet"/>
+      </w:pPr>
+      <w:r>
+        <w:t xml:space="preserve">Biblioteca versionada de proveedores, agentes, skills y plantillas. Cada cambio es un evento encadenado en el ledger del servidor, y cada corrida toma una instantánea al iniciar.</w:t>
+      </w:r>
+    </w:p>
+    <w:p>
+      <w:pPr>
+        <w:pStyle w:val="ListBullet"/>
+      </w:pPr>
+      <w:r>
+        <w:t xml:space="preserve">Roles del sistema (planificador, asesor, chat, trabajador y reparación) asignables a proveedor y modelo en la configuración. Un archivo que no cumple sus reglas se rechaza entero.</w:t>
+      </w:r>
+    </w:p>
+    <w:p>
+      <w:pPr>
+        <w:pStyle w:val="ListBullet"/>
+      </w:pPr>
+      <w:r>
+        <w:t xml:space="preserve">Prueba de conexión por proveedor: lista los modelos que sirve el endpoint y hace una llamada mínima. La clave no aparece en ninguna respuesta.</w:t>
+      </w:r>
+    </w:p>
+    <w:p>
+      <w:pPr>
+        <w:pStyle w:val="ListBullet"/>
+      </w:pPr>
+      <w:r>
+        <w:t xml:space="preserve">Consola: inicio con workflows activos, compuertas pendientes, agentes y costo; diseñador de workflows con comprobación en vivo contra el validador del servidor y cuatro plantillas integradas; editor de biblioteca; intervenciones del asesor y efectos en el detalle de cada workflow.</w:t>
+      </w:r>
+    </w:p>
+    <w:p>
+      <w:pPr>
+        <w:pStyle w:val="Heading1"/>
+      </w:pPr>
+      <w:r>
+        <w:t xml:space="preserve">38 Estado del plan 14</w:t>
+      </w:r>
+    </w:p>
+    <w:p>
+      <w:r>
+        <w:t xml:space="preserve">Q1 (adaptadores y skills), Q2 (biblioteca, proveedores y API) y Q4 (inicio y pantallas sin datos) están completos. En Q3 están hechos el diseñador de workflows, las plantillas integradas y el editor de biblioteca. Q3.3 y Q3.4 quedan bloqueadas por decisiones del usuario, y Q3.6 espera a ellas. El cierre incluye el README; la demo integrada (C.3) no se ha hecho, por pedido expreso.</w:t>
+      </w:r>
+    </w:p>
+    <w:p>
+      <w:pPr>
+        <w:pStyle w:val="Heading1"/>
+      </w:pPr>
+      <w:r>
+        <w:t xml:space="preserve">39 Invariantes del plan 14 y dónde se verifican</w:t>
+      </w:r>
+    </w:p>
+    <w:p>
+      <w:r>
+        <w:t xml:space="preserve">Cada invariante tiene un verificador en las pruebas automáticas y un criterio de falsación, como en los planes 08 a 13.</w:t>
+      </w:r>
+    </w:p>
+    <w:p>
+      <w:pPr>
+        <w:pStyle w:val="ListBullet"/>
+      </w:pPr>
+      <w:r>
+        <w:t xml:space="preserve">L1: una skill inyectada es de la biblioteca y su digest queda en la corrida. Verificado en el límite del runner.</w:t>
+      </w:r>
+    </w:p>
+    <w:p>
+      <w:pPr>
+        <w:pStyle w:val="ListBullet"/>
+      </w:pPr>
+      <w:r>
+        <w:t xml:space="preserve">L2: una skill no amplía permisos. El adaptador no cambia herramientas, permisos, sandbox ni presupuesto.</w:t>
+      </w:r>
+    </w:p>
+    <w:p>
+      <w:pPr>
+        <w:pStyle w:val="ListBullet"/>
+      </w:pPr>
+      <w:r>
+        <w:t xml:space="preserve">L3: la instantánea de la biblioteca se congela al iniciar la corrida. Una edición posterior no cambia lo que lee la corrida.</w:t>
+      </w:r>
+    </w:p>
+    <w:p>
+      <w:pPr>
+        <w:pStyle w:val="ListBullet"/>
+      </w:pPr>
+      <w:r>
+        <w:t xml:space="preserve">L4: las escrituras de la biblioteca exigen token y mismo origen. Una configuración inválida se rechaza entera, con todos sus problemas.</w:t>
+      </w:r>
+    </w:p>
+    <w:p>
+      <w:pPr>
+        <w:pStyle w:val="ListBullet"/>
+      </w:pPr>
+      <w:r>
+        <w:t xml:space="preserve">L5: un adaptador solo emite flags que su tabla declara, contrastados con el --help del binario instalado.</w:t>
+      </w:r>
+    </w:p>
+    <w:p>
+      <w:pPr>
+        <w:pStyle w:val="ListBullet"/>
+      </w:pPr>
+      <w:r>
+        <w:t xml:space="preserve">L6: cada rol del sistema corre sobre un proveedor y modelo declarados en la configuración final. Un rol sin proveedor válido no llega a arrancar.</w:t>
+      </w:r>
+    </w:p>
+    <w:p>
+      <w:pPr>
+        <w:pStyle w:val="Heading1"/>
+      </w:pPr>
+      <w:r>
+        <w:t xml:space="preserve">40 Límites y decisiones abiertas</w:t>
+      </w:r>
+    </w:p>
+    <w:p>
+      <w:r>
+        <w:t xml:space="preserve">Lo que sigue es real hoy, y se dice aquí en lugar de dejarlo implícito en el código.</w:t>
+      </w:r>
+    </w:p>
+    <w:p>
+      <w:pPr>
+        <w:pStyle w:val="ListBullet"/>
+      </w:pPr>
+      <w:r>
+        <w:t xml:space="preserve">Las corridas todavía no leen proveedores ni agentes de la biblioteca: el motor toma los proveedores del archivo de configuración. El manejador congelado de la biblioteca está listo para cuando lo lean.</w:t>
+      </w:r>
+    </w:p>
+    <w:p>
+      <w:pPr>
+        <w:pStyle w:val="ListBullet"/>
+      </w:pPr>
+      <w:r>
+        <w:t xml:space="preserve">Los roles trabajador y reparación del sistema solo llegan a una llamada en la ruta de misión sin orquestación. El motor de producción siempre orquesta, y los perfiles nativos llevan su propio proveedor.</w:t>
+      </w:r>
+    </w:p>
+    <w:p>
+      <w:pPr>
+        <w:pStyle w:val="ListBullet"/>
+      </w:pPr>
+      <w:r>
+        <w:t xml:space="preserve">Decisión abierta: si las corridas leen agentes de la biblioteca, y con qué precedencia frente al archivo.</w:t>
+      </w:r>
+    </w:p>
+    <w:p>
+      <w:pPr>
+        <w:pStyle w:val="ListBullet"/>
+      </w:pPr>
+      <w:r>
+        <w:t xml:space="preserve">Decisión abierta: el diseñador de agentes (Q3.3) y «probar agente» (Q3.4) esperan presupuesto, permisos, y si la prueba usa un proveedor sin costo.</w:t>
+      </w:r>
+    </w:p>
+    <w:p>
+      <w:pPr>
+        <w:pStyle w:val="ListBullet"/>
+      </w:pPr>
+      <w:r>
+        <w:t xml:space="preserve">Decisión abierta: el esquema de las plantillas guardadas en la biblioteca. Las cuatro plantillas integradas no lo necesitan.</w:t>
+      </w:r>
+    </w:p>
+    <w:p>
+      <w:pPr>
+        <w:pStyle w:val="ListBullet"/>
+      </w:pPr>
+      <w:r>
+        <w:t xml:space="preserve">Decisión abierta: la forma canónica de la biblioteca acepta números decimales (precios) con una opción propia. Los digests de peticiones y del journal siguen siendo solo enteros.</w:t>
+      </w:r>
+    </w:p>
     <w:sectPr>
       <w:footerReference w:type="default" r:id="rId9"/>
       <w:pgSz w:w="12240" w:h="15840"/>
@@ -24067,7 +24263,7 @@
         <w:color w:val="505050"/>
         <w:sz w:val="16"/>
       </w:rPr>
-      <w:t xml:space="preserve">Synapser  ·  Diseño 0.4  ·  </w:t>
+      <w:t xml:space="preserve">Synapser  ·  Diseño 0.5  ·  </w:t>
     </w:r>
     <w:fldSimple w:instr="PAGE"/>
   </w:p>

</xml_diff>

<commit_message>
Update section 40 of the design document with the decisions
The section said that runs did not read the library yet, that the library's key names
were unrestricted, and that the decisions were open. Those statements are out of date:
runs read the library from their snapshot, library keys are limited by providerKeyEnv,
and D1 to D7 are decided (their implementation is P15.4 to P15.7).

Co-Authored-By: Claude Haiku 5.5 <noreply@anthropic.com>
</commit_message>
<xml_diff>
--- a/design/Synapser_Diseno.docx
+++ b/design/Synapser_Diseno.docx
@@ -24196,7 +24196,7 @@
         <w:pStyle w:val="ListBullet"/>
       </w:pPr>
       <w:r>
-        <w:t xml:space="preserve">Las corridas todavía no leen proveedores ni agentes de la biblioteca: el motor toma los proveedores del archivo de configuración. El manejador congelado de la biblioteca está listo para cuando lo lean.</w:t>
+        <w:t xml:space="preserve">Las corridas leen los proveedores y los agentes de la biblioteca desde su instantánea, tomada al arrancar, y los comprueban contra el archivo de configuración vigente. Una biblioteca que no cumple detiene la corrida, con todos sus motivos. Las skills de la biblioteca todavía no se inyectan (Q5.4: el archivo asigna las skills, decisión D6; pendiente de implementar).</w:t>
       </w:r>
     </w:p>
     <w:p>
@@ -24212,7 +24212,7 @@
         <w:pStyle w:val="ListBullet"/>
       </w:pPr>
       <w:r>
-        <w:t xml:space="preserve">Decisión del usuario: las corridas leen la biblioteca. La precedencia es sólo-añadir, propuesta de Claude pendiente de confirmación.</w:t>
+        <w:t xml:space="preserve">Decisión del usuario: las corridas leen la biblioteca. La precedencia es sólo-añadir, confirmada por el usuario el 14 de octubre.</w:t>
       </w:r>
     </w:p>
     <w:p>
@@ -24220,7 +24220,7 @@
         <w:pStyle w:val="ListBullet"/>
       </w:pPr>
       <w:r>
-        <w:t xml:space="preserve">Decisión abierta: el diseñador de agentes (Q3.3) y «probar agente» (Q3.4) esperan presupuesto, permisos, y si la prueba usa un proveedor sin costo.</w:t>
+        <w:t xml:space="preserve">Decisión del usuario (14 de octubre): «probar agente» tiene un tope de tiempo obligatorio en los CLI sin tope en dólares, un proveedor de prueba marcado en el archivo, y una copia que se borra al terminar, con su registro. Se diseña al final del plan. El diseñador de agentes (Q3.3) se construye ahora.</w:t>
       </w:r>
     </w:p>
     <w:p>
@@ -24244,7 +24244,7 @@
         <w:pStyle w:val="ListBullet"/>
       </w:pPr>
       <w:r>
-        <w:t xml:space="preserve">Riesgo declarado: la clave de un proveedor puede ser cualquier variable de entorno del servidor, y la prueba de conexión la envía al endpoint https que nombre el documento guardado. El token de sesión lo obtiene cualquier proceso local, porque la API solo escucha en 127.0.0.1: una página de otro sitio no puede usarlo, pero un proceso local sí. Pendiente de decisión: lista blanca de variables, confirmación de los cambios de baseUrl y un modelo de amenaza explícito, que el plan 15 documenta; sus decisiones D1 a D7 siguen abiertas.</w:t>
+        <w:t xml:space="preserve">Riesgo declarado: un proveedor del archivo puede usar cualquier variable de entorno del servidor, y la prueba de conexión la envía al endpoint https que nombre el documento guardado. Un proveedor de biblioteca solo puede usar las variables que el archivo permite en `providerKeyEnv`, que está vacía por defecto. El token de sesión lo obtiene cualquier proceso local, porque la API solo escucha en 127.0.0.1: una página de otro sitio no puede usarlo, pero un proceso local sí. La comprobación de Host (IC4) mitiga el rebinding de DNS. Decididos el 14 de octubre y sin implementar: el token en cookie HttpOnly (P15.4), la política de destinos (P15.5), las tarifas solo del archivo (P15.6) y el modo de confianza configurable (P15.7). La red de los CLI (D5) se investiga antes de decidir. El plan 15 documenta el modelo de amenaza.</w:t>
       </w:r>
     </w:p>
     <w:sectPr>

</xml_diff>